<commit_message>
Update documentation and enhance data organization for Pass A/B simulations
- Reversed plot order in `hero_model_reset_bundle.py` to place the naive model on the left and the hero model on the right for better clarity.
- Updated `statistics.json` with revised user and agent message counts, and adjusted last updated timestamps for accurate tracking.
- Added new CSV files for Pass B generative knockout data and updated existing files to reflect the latest simulation outputs.
- Removed obsolete files related to previous knockout analyses to streamline project resources.

These changes improve the clarity and organization of the documentation and data, facilitating better understanding and execution of simulations.
</commit_message>
<xml_diff>
--- a/3-Master_Plan/re_entry/Alex_3_questions.docx
+++ b/3-Master_Plan/re_entry/Alex_3_questions.docx
@@ -40,12 +40,15 @@
       </w:pPr>
       <w:r>
         <w:rPr>
-          <w:rFonts w:ascii="Times New Roman" w:eastAsia="Times New Roman" w:hAnsi="Times New Roman" w:cs="Times New Roman"/>
           <w:noProof/>
-          <w:kern w:val="0"/>
-        </w:rPr>
-        <w:pict w14:anchorId="267D47BE">
-          <v:rect id="_x0000_i1029" alt="" style="width:468pt;height:.05pt;mso-width-percent:0;mso-height-percent:0;mso-width-percent:0;mso-height-percent:0" o:hralign="center" o:hrstd="t" o:hr="t" fillcolor="#a0a0a0" stroked="f"/>
+        </w:rPr>
+      </w:r>
+      <w:r>
+        <w:pict w14:anchorId="149965D6">
+          <v:rect id="Horizontal Line 1" o:spid="_x0000_s1035" style="width:540pt;height:.1pt;visibility:visible;mso-wrap-style:square;mso-left-percent:-10001;mso-top-percent:-10001;mso-position-horizontal:absolute;mso-position-horizontal-relative:char;mso-position-vertical:absolute;mso-position-vertical-relative:line;mso-left-percent:-10001;mso-top-percent:-10001;v-text-anchor:top" o:gfxdata="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" filled="f">
+            <o:lock v:ext="edit" rotation="t" aspectratio="t" verticies="t" text="t" shapetype="t"/>
+            <w10:anchorlock/>
+          </v:rect>
         </w:pict>
       </w:r>
     </w:p>
@@ -686,12 +689,15 @@
       </w:pPr>
       <w:r>
         <w:rPr>
-          <w:rFonts w:ascii="Times New Roman" w:eastAsia="Times New Roman" w:hAnsi="Times New Roman" w:cs="Times New Roman"/>
           <w:noProof/>
-          <w:kern w:val="0"/>
-        </w:rPr>
-        <w:pict w14:anchorId="77E95224">
-          <v:rect id="_x0000_i1028" alt="" style="width:468pt;height:.05pt;mso-width-percent:0;mso-height-percent:0;mso-width-percent:0;mso-height-percent:0" o:hralign="center" o:hrstd="t" o:hr="t" fillcolor="#a0a0a0" stroked="f"/>
+        </w:rPr>
+      </w:r>
+      <w:r>
+        <w:pict w14:anchorId="17181B5A">
+          <v:rect id="Horizontal Line 2" o:spid="_x0000_s1034" style="width:540pt;height:.1pt;visibility:visible;mso-wrap-style:square;mso-left-percent:-10001;mso-top-percent:-10001;mso-position-horizontal:absolute;mso-position-horizontal-relative:char;mso-position-vertical:absolute;mso-position-vertical-relative:line;mso-left-percent:-10001;mso-top-percent:-10001;v-text-anchor:top" o:gfxdata="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" filled="f">
+            <o:lock v:ext="edit" rotation="t" aspectratio="t" verticies="t" text="t" shapetype="t"/>
+            <w10:anchorlock/>
+          </v:rect>
         </w:pict>
       </w:r>
     </w:p>
@@ -1674,12 +1680,15 @@
       </w:pPr>
       <w:r>
         <w:rPr>
-          <w:rFonts w:ascii="Times New Roman" w:eastAsia="Times New Roman" w:hAnsi="Times New Roman" w:cs="Times New Roman"/>
           <w:noProof/>
-          <w:kern w:val="0"/>
-        </w:rPr>
-        <w:pict w14:anchorId="3CA8703D">
-          <v:rect id="_x0000_i1027" style="width:0;height:1.5pt" o:hralign="center" o:hrstd="t" o:hr="t" fillcolor="#a0a0a0" stroked="f"/>
+        </w:rPr>
+      </w:r>
+      <w:r>
+        <w:pict w14:anchorId="2424F821">
+          <v:rect id="Horizontal Line 3" o:spid="_x0000_s1033" style="width:540pt;height:.1pt;visibility:visible;mso-wrap-style:square;mso-left-percent:-10001;mso-top-percent:-10001;mso-position-horizontal:absolute;mso-position-horizontal-relative:char;mso-position-vertical:absolute;mso-position-vertical-relative:line;mso-left-percent:-10001;mso-top-percent:-10001;v-text-anchor:top" o:gfxdata="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" filled="f">
+            <o:lock v:ext="edit" rotation="t" aspectratio="t" verticies="t" text="t" shapetype="t"/>
+            <w10:anchorlock/>
+          </v:rect>
         </w:pict>
       </w:r>
     </w:p>
@@ -2624,12 +2633,15 @@
       </w:pPr>
       <w:r>
         <w:rPr>
-          <w:rFonts w:ascii="Times New Roman" w:eastAsia="Times New Roman" w:hAnsi="Times New Roman" w:cs="Times New Roman"/>
           <w:noProof/>
-          <w:kern w:val="0"/>
-        </w:rPr>
-        <w:pict w14:anchorId="23EB6B64">
-          <v:rect id="_x0000_i1026" style="width:0;height:1.5pt" o:hralign="center" o:hrstd="t" o:hr="t" fillcolor="#a0a0a0" stroked="f"/>
+        </w:rPr>
+      </w:r>
+      <w:r>
+        <w:pict w14:anchorId="29B21C56">
+          <v:rect id="Horizontal Line 4" o:spid="_x0000_s1032" style="width:540pt;height:.1pt;visibility:visible;mso-wrap-style:square;mso-left-percent:-10001;mso-top-percent:-10001;mso-position-horizontal:absolute;mso-position-horizontal-relative:char;mso-position-vertical:absolute;mso-position-vertical-relative:line;mso-left-percent:-10001;mso-top-percent:-10001;v-text-anchor:top" o:gfxdata="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" filled="f">
+            <o:lock v:ext="edit" rotation="t" aspectratio="t" verticies="t" text="t" shapetype="t"/>
+            <w10:anchorlock/>
+          </v:rect>
         </w:pict>
       </w:r>
     </w:p>
@@ -4408,12 +4420,15 @@
       </w:pPr>
       <w:r>
         <w:rPr>
-          <w:rFonts w:ascii="Times New Roman" w:eastAsia="Times New Roman" w:hAnsi="Times New Roman" w:cs="Times New Roman"/>
           <w:noProof/>
-          <w:kern w:val="0"/>
-        </w:rPr>
-        <w:pict w14:anchorId="1E2BCC4A">
-          <v:rect id="_x0000_i1025" style="width:0;height:1.5pt" o:hralign="center" o:hrstd="t" o:hr="t" fillcolor="#a0a0a0" stroked="f"/>
+        </w:rPr>
+      </w:r>
+      <w:r>
+        <w:pict w14:anchorId="75E1C763">
+          <v:rect id="Horizontal Line 5" o:spid="_x0000_s1031" style="width:540pt;height:.1pt;visibility:visible;mso-wrap-style:square;mso-left-percent:-10001;mso-top-percent:-10001;mso-position-horizontal:absolute;mso-position-horizontal-relative:char;mso-position-vertical:absolute;mso-position-vertical-relative:line;mso-left-percent:-10001;mso-top-percent:-10001;v-text-anchor:top" o:gfxdata="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" filled="f">
+            <o:lock v:ext="edit" rotation="t" aspectratio="t" verticies="t" text="t" shapetype="t"/>
+            <w10:anchorlock/>
+          </v:rect>
         </w:pict>
       </w:r>
     </w:p>
@@ -4998,6 +5013,2802 @@
         <w:t> (two-way ventile table + margin script on the locked hero panel) — that would turn #3 from a Pertinent Thought into a checklist item.</w:t>
       </w:r>
     </w:p>
+    <w:p>
+      <w:r>
+        <w:br w:type="page"/>
+      </w:r>
+    </w:p>
+    <w:p>
+      <w:pPr>
+        <w:shd w:val="clear" w:color="auto" w:fill="FCFCFC"/>
+        <w:spacing w:before="216" w:after="84" w:line="240" w:lineRule="auto"/>
+        <w:outlineLvl w:val="1"/>
+        <w:rPr>
+          <w:rFonts w:ascii="Arial" w:eastAsia="Times New Roman" w:hAnsi="Arial" w:cs="Arial"/>
+          <w:b/>
+          <w:bCs/>
+          <w:color w:val="141414"/>
+          <w:kern w:val="0"/>
+          <w:sz w:val="32"/>
+          <w:szCs w:val="32"/>
+          <w14:ligatures w14:val="none"/>
+        </w:rPr>
+      </w:pPr>
+      <w:r>
+        <w:rPr>
+          <w:rFonts w:ascii="Arial" w:eastAsia="Times New Roman" w:hAnsi="Arial" w:cs="Arial"/>
+          <w:b/>
+          <w:bCs/>
+          <w:color w:val="141414"/>
+          <w:kern w:val="0"/>
+          <w:sz w:val="32"/>
+          <w:szCs w:val="32"/>
+          <w14:ligatures w14:val="none"/>
+        </w:rPr>
+        <w:lastRenderedPageBreak/>
+        <w:t>What Alex actually wants (not quite the hero plot)</w:t>
+      </w:r>
+    </w:p>
+    <w:p>
+      <w:pPr>
+        <w:shd w:val="clear" w:color="auto" w:fill="FCFCFC"/>
+        <w:spacing w:before="120" w:after="120" w:line="240" w:lineRule="auto"/>
+        <w:rPr>
+          <w:rFonts w:ascii="Arial" w:eastAsia="Times New Roman" w:hAnsi="Arial" w:cs="Arial"/>
+          <w:color w:val="141414"/>
+          <w:kern w:val="0"/>
+          <w:sz w:val="20"/>
+          <w:szCs w:val="20"/>
+          <w14:ligatures w14:val="none"/>
+        </w:rPr>
+      </w:pPr>
+      <w:r>
+        <w:rPr>
+          <w:rFonts w:ascii="Arial" w:eastAsia="Times New Roman" w:hAnsi="Arial" w:cs="Arial"/>
+          <w:b/>
+          <w:bCs/>
+          <w:color w:val="141414"/>
+          <w:kern w:val="0"/>
+          <w:sz w:val="20"/>
+          <w:szCs w:val="20"/>
+          <w14:ligatures w14:val="none"/>
+        </w:rPr>
+        <w:t>Your instinct:</w:t>
+      </w:r>
+      <w:r>
+        <w:rPr>
+          <w:rFonts w:ascii="Arial" w:eastAsia="Times New Roman" w:hAnsi="Arial" w:cs="Arial"/>
+          <w:color w:val="141414"/>
+          <w:kern w:val="0"/>
+          <w:sz w:val="20"/>
+          <w:szCs w:val="20"/>
+          <w14:ligatures w14:val="none"/>
+        </w:rPr>
+        <w:t> “Isn’t the inverted-U already the quantification?”</w:t>
+      </w:r>
+    </w:p>
+    <w:p>
+      <w:pPr>
+        <w:shd w:val="clear" w:color="auto" w:fill="FCFCFC"/>
+        <w:spacing w:before="120" w:after="120" w:line="240" w:lineRule="auto"/>
+        <w:rPr>
+          <w:rFonts w:ascii="Arial" w:eastAsia="Times New Roman" w:hAnsi="Arial" w:cs="Arial"/>
+          <w:color w:val="141414"/>
+          <w:kern w:val="0"/>
+          <w:sz w:val="20"/>
+          <w:szCs w:val="20"/>
+          <w14:ligatures w14:val="none"/>
+        </w:rPr>
+      </w:pPr>
+      <w:r>
+        <w:rPr>
+          <w:rFonts w:ascii="Arial" w:eastAsia="Times New Roman" w:hAnsi="Arial" w:cs="Arial"/>
+          <w:b/>
+          <w:bCs/>
+          <w:color w:val="141414"/>
+          <w:kern w:val="0"/>
+          <w:sz w:val="20"/>
+          <w:szCs w:val="20"/>
+          <w14:ligatures w14:val="none"/>
+        </w:rPr>
+        <w:t>Alex’s answer:</w:t>
+      </w:r>
+      <w:r>
+        <w:rPr>
+          <w:rFonts w:ascii="Arial" w:eastAsia="Times New Roman" w:hAnsi="Arial" w:cs="Arial"/>
+          <w:color w:val="141414"/>
+          <w:kern w:val="0"/>
+          <w:sz w:val="20"/>
+          <w:szCs w:val="20"/>
+          <w14:ligatures w14:val="none"/>
+        </w:rPr>
+        <w:t> </w:t>
+      </w:r>
+      <w:r>
+        <w:rPr>
+          <w:rFonts w:ascii="Arial" w:eastAsia="Times New Roman" w:hAnsi="Arial" w:cs="Arial"/>
+          <w:b/>
+          <w:bCs/>
+          <w:color w:val="141414"/>
+          <w:kern w:val="0"/>
+          <w:sz w:val="20"/>
+          <w:szCs w:val="20"/>
+          <w14:ligatures w14:val="none"/>
+        </w:rPr>
+        <w:t>Partially, but no.</w:t>
+      </w:r>
+      <w:r>
+        <w:rPr>
+          <w:rFonts w:ascii="Arial" w:eastAsia="Times New Roman" w:hAnsi="Arial" w:cs="Arial"/>
+          <w:color w:val="141414"/>
+          <w:kern w:val="0"/>
+          <w:sz w:val="20"/>
+          <w:szCs w:val="20"/>
+          <w14:ligatures w14:val="none"/>
+        </w:rPr>
+        <w:t> The hero plot is </w:t>
+      </w:r>
+      <w:r>
+        <w:rPr>
+          <w:rFonts w:ascii="Arial" w:eastAsia="Times New Roman" w:hAnsi="Arial" w:cs="Arial"/>
+          <w:b/>
+          <w:bCs/>
+          <w:color w:val="141414"/>
+          <w:kern w:val="0"/>
+          <w:sz w:val="20"/>
+          <w:szCs w:val="20"/>
+          <w14:ligatures w14:val="none"/>
+        </w:rPr>
+        <w:t>E[Y | poolq_loo]</w:t>
+      </w:r>
+      <w:r>
+        <w:rPr>
+          <w:rFonts w:ascii="Arial" w:eastAsia="Times New Roman" w:hAnsi="Arial" w:cs="Arial"/>
+          <w:color w:val="141414"/>
+          <w:kern w:val="0"/>
+          <w:sz w:val="20"/>
+          <w:szCs w:val="20"/>
+          <w14:ligatures w14:val="none"/>
+        </w:rPr>
+        <w:t> in a world where roster pressure </w:t>
+      </w:r>
+      <w:r>
+        <w:rPr>
+          <w:rFonts w:ascii="Arial" w:eastAsia="Times New Roman" w:hAnsi="Arial" w:cs="Arial"/>
+          <w:b/>
+          <w:bCs/>
+          <w:color w:val="141414"/>
+          <w:kern w:val="0"/>
+          <w:sz w:val="20"/>
+          <w:szCs w:val="20"/>
+          <w14:ligatures w14:val="none"/>
+        </w:rPr>
+        <w:t>already exists</w:t>
+      </w:r>
+      <w:r>
+        <w:rPr>
+          <w:rFonts w:ascii="Arial" w:eastAsia="Times New Roman" w:hAnsi="Arial" w:cs="Arial"/>
+          <w:color w:val="141414"/>
+          <w:kern w:val="0"/>
+          <w:sz w:val="20"/>
+          <w:szCs w:val="20"/>
+          <w14:ligatures w14:val="none"/>
+        </w:rPr>
+        <w:t> in how scouts/selectors behave. It shows the </w:t>
+      </w:r>
+      <w:r>
+        <w:rPr>
+          <w:rFonts w:ascii="Arial" w:eastAsia="Times New Roman" w:hAnsi="Arial" w:cs="Arial"/>
+          <w:b/>
+          <w:bCs/>
+          <w:color w:val="141414"/>
+          <w:kern w:val="0"/>
+          <w:sz w:val="20"/>
+          <w:szCs w:val="20"/>
+          <w14:ligatures w14:val="none"/>
+        </w:rPr>
+        <w:t>first-order relationship</w:t>
+      </w:r>
+      <w:r>
+        <w:rPr>
+          <w:rFonts w:ascii="Arial" w:eastAsia="Times New Roman" w:hAnsi="Arial" w:cs="Arial"/>
+          <w:color w:val="141414"/>
+          <w:kern w:val="0"/>
+          <w:sz w:val="20"/>
+          <w:szCs w:val="20"/>
+          <w14:ligatures w14:val="none"/>
+        </w:rPr>
+        <w:t> with congestion present. It does </w:t>
+      </w:r>
+      <w:r>
+        <w:rPr>
+          <w:rFonts w:ascii="Arial" w:eastAsia="Times New Roman" w:hAnsi="Arial" w:cs="Arial"/>
+          <w:b/>
+          <w:bCs/>
+          <w:color w:val="141414"/>
+          <w:kern w:val="0"/>
+          <w:sz w:val="20"/>
+          <w:szCs w:val="20"/>
+          <w14:ligatures w14:val="none"/>
+        </w:rPr>
+        <w:t>not</w:t>
+      </w:r>
+      <w:r>
+        <w:rPr>
+          <w:rFonts w:ascii="Arial" w:eastAsia="Times New Roman" w:hAnsi="Arial" w:cs="Arial"/>
+          <w:color w:val="141414"/>
+          <w:kern w:val="0"/>
+          <w:sz w:val="20"/>
+          <w:szCs w:val="20"/>
+          <w14:ligatures w14:val="none"/>
+        </w:rPr>
+        <w:t> answer:</w:t>
+      </w:r>
+    </w:p>
+    <w:p>
+      <w:pPr>
+        <w:shd w:val="clear" w:color="auto" w:fill="FCFCFC"/>
+        <w:spacing w:after="0" w:line="240" w:lineRule="auto"/>
+        <w:rPr>
+          <w:rFonts w:ascii="Arial" w:eastAsia="Times New Roman" w:hAnsi="Arial" w:cs="Arial"/>
+          <w:kern w:val="0"/>
+          <w:sz w:val="20"/>
+          <w:szCs w:val="20"/>
+          <w14:ligatures w14:val="none"/>
+        </w:rPr>
+      </w:pPr>
+      <w:r>
+        <w:rPr>
+          <w:rFonts w:ascii="Arial" w:eastAsia="Times New Roman" w:hAnsi="Arial" w:cs="Arial"/>
+          <w:kern w:val="0"/>
+          <w:sz w:val="20"/>
+          <w:szCs w:val="20"/>
+          <w14:ligatures w14:val="none"/>
+        </w:rPr>
+        <w:t>“How much better is my </w:t>
+      </w:r>
+      <w:r>
+        <w:rPr>
+          <w:rFonts w:ascii="Arial" w:eastAsia="Times New Roman" w:hAnsi="Arial" w:cs="Arial"/>
+          <w:b/>
+          <w:bCs/>
+          <w:kern w:val="0"/>
+          <w:sz w:val="20"/>
+          <w:szCs w:val="20"/>
+          <w14:ligatures w14:val="none"/>
+        </w:rPr>
+        <w:t>prediction</w:t>
+      </w:r>
+      <w:r>
+        <w:rPr>
+          <w:rFonts w:ascii="Arial" w:eastAsia="Times New Roman" w:hAnsi="Arial" w:cs="Arial"/>
+          <w:kern w:val="0"/>
+          <w:sz w:val="20"/>
+          <w:szCs w:val="20"/>
+          <w14:ligatures w14:val="none"/>
+        </w:rPr>
+        <w:t> if I include roster pressure in the model, vs ability alone?”</w:t>
+      </w:r>
+    </w:p>
+    <w:p>
+      <w:pPr>
+        <w:shd w:val="clear" w:color="auto" w:fill="FCFCFC"/>
+        <w:spacing w:before="120" w:after="120" w:line="240" w:lineRule="auto"/>
+        <w:rPr>
+          <w:rFonts w:ascii="Arial" w:eastAsia="Times New Roman" w:hAnsi="Arial" w:cs="Arial"/>
+          <w:color w:val="141414"/>
+          <w:kern w:val="0"/>
+          <w:sz w:val="20"/>
+          <w:szCs w:val="20"/>
+          <w14:ligatures w14:val="none"/>
+        </w:rPr>
+      </w:pPr>
+      <w:r>
+        <w:rPr>
+          <w:rFonts w:ascii="Arial" w:eastAsia="Times New Roman" w:hAnsi="Arial" w:cs="Arial"/>
+          <w:color w:val="141414"/>
+          <w:kern w:val="0"/>
+          <w:sz w:val="20"/>
+          <w:szCs w:val="20"/>
+          <w14:ligatures w14:val="none"/>
+        </w:rPr>
+        <w:t>He wants a </w:t>
+      </w:r>
+      <w:r>
+        <w:rPr>
+          <w:rFonts w:ascii="Arial" w:eastAsia="Times New Roman" w:hAnsi="Arial" w:cs="Arial"/>
+          <w:b/>
+          <w:bCs/>
+          <w:color w:val="141414"/>
+          <w:kern w:val="0"/>
+          <w:sz w:val="20"/>
+          <w:szCs w:val="20"/>
+          <w14:ligatures w14:val="none"/>
+        </w:rPr>
+        <w:t>counterfactual at the assessment/selection layer</w:t>
+      </w:r>
+      <w:r>
+        <w:rPr>
+          <w:rFonts w:ascii="Arial" w:eastAsia="Times New Roman" w:hAnsi="Arial" w:cs="Arial"/>
+          <w:color w:val="141414"/>
+          <w:kern w:val="0"/>
+          <w:sz w:val="20"/>
+          <w:szCs w:val="20"/>
+          <w14:ligatures w14:val="none"/>
+        </w:rPr>
+        <w:t>, not a rewound life story.</w:t>
+      </w:r>
+    </w:p>
+    <w:p>
+      <w:pPr>
+        <w:shd w:val="clear" w:color="auto" w:fill="FCFCFC"/>
+        <w:spacing w:before="120" w:after="120" w:line="240" w:lineRule="auto"/>
+        <w:rPr>
+          <w:rFonts w:ascii="Arial" w:eastAsia="Times New Roman" w:hAnsi="Arial" w:cs="Arial"/>
+          <w:color w:val="141414"/>
+          <w:kern w:val="0"/>
+          <w:sz w:val="20"/>
+          <w:szCs w:val="20"/>
+          <w14:ligatures w14:val="none"/>
+        </w:rPr>
+      </w:pPr>
+      <w:r>
+        <w:rPr>
+          <w:rFonts w:ascii="Arial" w:eastAsia="Times New Roman" w:hAnsi="Arial" w:cs="Arial"/>
+          <w:b/>
+          <w:bCs/>
+          <w:color w:val="141414"/>
+          <w:kern w:val="0"/>
+          <w:sz w:val="20"/>
+          <w:szCs w:val="20"/>
+          <w14:ligatures w14:val="none"/>
+        </w:rPr>
+        <w:t>Not this:</w:t>
+      </w:r>
+      <w:r>
+        <w:rPr>
+          <w:rFonts w:ascii="Arial" w:eastAsia="Times New Roman" w:hAnsi="Arial" w:cs="Arial"/>
+          <w:color w:val="141414"/>
+          <w:kern w:val="0"/>
+          <w:sz w:val="20"/>
+          <w:szCs w:val="20"/>
+          <w14:ligatures w14:val="none"/>
+        </w:rPr>
+        <w:t> “What if you hadn’t played four years on that roster?” (development / ppm contaminated by peers)</w:t>
+      </w:r>
+    </w:p>
+    <w:p>
+      <w:pPr>
+        <w:shd w:val="clear" w:color="auto" w:fill="FCFCFC"/>
+        <w:spacing w:before="120" w:after="120" w:line="240" w:lineRule="auto"/>
+        <w:rPr>
+          <w:rFonts w:ascii="Arial" w:eastAsia="Times New Roman" w:hAnsi="Arial" w:cs="Arial"/>
+          <w:color w:val="141414"/>
+          <w:kern w:val="0"/>
+          <w:sz w:val="20"/>
+          <w:szCs w:val="20"/>
+          <w14:ligatures w14:val="none"/>
+        </w:rPr>
+      </w:pPr>
+      <w:r>
+        <w:rPr>
+          <w:rFonts w:ascii="Arial" w:eastAsia="Times New Roman" w:hAnsi="Arial" w:cs="Arial"/>
+          <w:b/>
+          <w:bCs/>
+          <w:color w:val="141414"/>
+          <w:kern w:val="0"/>
+          <w:sz w:val="20"/>
+          <w:szCs w:val="20"/>
+          <w14:ligatures w14:val="none"/>
+        </w:rPr>
+        <w:t>This:</w:t>
+      </w:r>
+      <w:r>
+        <w:rPr>
+          <w:rFonts w:ascii="Arial" w:eastAsia="Times New Roman" w:hAnsi="Arial" w:cs="Arial"/>
+          <w:color w:val="141414"/>
+          <w:kern w:val="0"/>
+          <w:sz w:val="20"/>
+          <w:szCs w:val="20"/>
+          <w14:ligatures w14:val="none"/>
+        </w:rPr>
+        <w:t> “Same player, same career — but the </w:t>
+      </w:r>
+      <w:r>
+        <w:rPr>
+          <w:rFonts w:ascii="Arial" w:eastAsia="Times New Roman" w:hAnsi="Arial" w:cs="Arial"/>
+          <w:b/>
+          <w:bCs/>
+          <w:color w:val="141414"/>
+          <w:kern w:val="0"/>
+          <w:sz w:val="20"/>
+          <w:szCs w:val="20"/>
+          <w14:ligatures w14:val="none"/>
+        </w:rPr>
+        <w:t>selection process</w:t>
+      </w:r>
+      <w:r>
+        <w:rPr>
+          <w:rFonts w:ascii="Arial" w:eastAsia="Times New Roman" w:hAnsi="Arial" w:cs="Arial"/>
+          <w:color w:val="141414"/>
+          <w:kern w:val="0"/>
+          <w:sz w:val="20"/>
+          <w:szCs w:val="20"/>
+          <w14:ligatures w14:val="none"/>
+        </w:rPr>
+        <w:t> evaluates you as if scouts had unlimited capacity and </w:t>
+      </w:r>
+      <w:r>
+        <w:rPr>
+          <w:rFonts w:ascii="Arial" w:eastAsia="Times New Roman" w:hAnsi="Arial" w:cs="Arial"/>
+          <w:b/>
+          <w:bCs/>
+          <w:color w:val="141414"/>
+          <w:kern w:val="0"/>
+          <w:sz w:val="20"/>
+          <w:szCs w:val="20"/>
+          <w14:ligatures w14:val="none"/>
+        </w:rPr>
+        <w:t>ignore roster congestion</w:t>
+      </w:r>
+      <w:r>
+        <w:rPr>
+          <w:rFonts w:ascii="Arial" w:eastAsia="Times New Roman" w:hAnsi="Arial" w:cs="Arial"/>
+          <w:color w:val="141414"/>
+          <w:kern w:val="0"/>
+          <w:sz w:val="20"/>
+          <w:szCs w:val="20"/>
+          <w14:ligatures w14:val="none"/>
+        </w:rPr>
+        <w:t> in the score.” Fabricated λ = 0 world in the </w:t>
+      </w:r>
+      <w:r>
+        <w:rPr>
+          <w:rFonts w:ascii="Arial" w:eastAsia="Times New Roman" w:hAnsi="Arial" w:cs="Arial"/>
+          <w:b/>
+          <w:bCs/>
+          <w:color w:val="141414"/>
+          <w:kern w:val="0"/>
+          <w:sz w:val="20"/>
+          <w:szCs w:val="20"/>
+          <w14:ligatures w14:val="none"/>
+        </w:rPr>
+        <w:t>predictive model</w:t>
+      </w:r>
+      <w:r>
+        <w:rPr>
+          <w:rFonts w:ascii="Arial" w:eastAsia="Times New Roman" w:hAnsi="Arial" w:cs="Arial"/>
+          <w:color w:val="141414"/>
+          <w:kern w:val="0"/>
+          <w:sz w:val="20"/>
+          <w:szCs w:val="20"/>
+          <w14:ligatures w14:val="none"/>
+        </w:rPr>
+        <w:t>, analogous to Pass A’s talent-only score arm.</w:t>
+      </w:r>
+    </w:p>
+    <w:p>
+      <w:pPr>
+        <w:shd w:val="clear" w:color="auto" w:fill="FCFCFC"/>
+        <w:spacing w:before="120" w:after="120" w:line="240" w:lineRule="auto"/>
+        <w:rPr>
+          <w:rFonts w:ascii="Arial" w:eastAsia="Times New Roman" w:hAnsi="Arial" w:cs="Arial"/>
+          <w:color w:val="141414"/>
+          <w:kern w:val="0"/>
+          <w:sz w:val="20"/>
+          <w:szCs w:val="20"/>
+          <w14:ligatures w14:val="none"/>
+        </w:rPr>
+      </w:pPr>
+      <w:r>
+        <w:rPr>
+          <w:rFonts w:ascii="Arial" w:eastAsia="Times New Roman" w:hAnsi="Arial" w:cs="Arial"/>
+          <w:color w:val="141414"/>
+          <w:kern w:val="0"/>
+          <w:sz w:val="20"/>
+          <w:szCs w:val="20"/>
+          <w14:ligatures w14:val="none"/>
+        </w:rPr>
+        <w:t>Charles’s Army analogy landed: brigade commanders with </w:t>
+      </w:r>
+      <w:r>
+        <w:rPr>
+          <w:rFonts w:ascii="Arial" w:eastAsia="Times New Roman" w:hAnsi="Arial" w:cs="Arial"/>
+          <w:b/>
+          <w:bCs/>
+          <w:color w:val="141414"/>
+          <w:kern w:val="0"/>
+          <w:sz w:val="20"/>
+          <w:szCs w:val="20"/>
+          <w14:ligatures w14:val="none"/>
+        </w:rPr>
+        <w:t>no cap on top blocks</w:t>
+      </w:r>
+      <w:r>
+        <w:rPr>
+          <w:rFonts w:ascii="Arial" w:eastAsia="Times New Roman" w:hAnsi="Arial" w:cs="Arial"/>
+          <w:color w:val="141414"/>
+          <w:kern w:val="0"/>
+          <w:sz w:val="20"/>
+          <w:szCs w:val="20"/>
+          <w14:ligatures w14:val="none"/>
+        </w:rPr>
+        <w:t> — everyone gets a fair individual read; roster congestion doesn’t enter the promotion score.</w:t>
+      </w:r>
+    </w:p>
+    <w:p>
+      <w:pPr>
+        <w:spacing w:before="240" w:after="240" w:line="240" w:lineRule="auto"/>
+        <w:rPr>
+          <w:rFonts w:ascii="Arial" w:eastAsia="Times New Roman" w:hAnsi="Arial" w:cs="Arial"/>
+          <w:kern w:val="0"/>
+          <w:sz w:val="20"/>
+          <w:szCs w:val="20"/>
+          <w14:ligatures w14:val="none"/>
+        </w:rPr>
+      </w:pPr>
+      <w:r>
+        <w:rPr>
+          <w:noProof/>
+        </w:rPr>
+      </w:r>
+      <w:r>
+        <w:pict w14:anchorId="4D2B05C5">
+          <v:rect id="Horizontal Line 11" o:spid="_x0000_s1030" style="width:540pt;height:.1pt;visibility:visible;mso-wrap-style:square;mso-left-percent:-10001;mso-top-percent:-10001;mso-position-horizontal:absolute;mso-position-horizontal-relative:char;mso-position-vertical:absolute;mso-position-vertical-relative:line;mso-left-percent:-10001;mso-top-percent:-10001;v-text-anchor:top" o:gfxdata="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" filled="f">
+            <o:lock v:ext="edit" rotation="t" aspectratio="t" verticies="t" text="t" shapetype="t"/>
+            <w10:anchorlock/>
+          </v:rect>
+        </w:pict>
+      </w:r>
+    </w:p>
+    <w:p>
+      <w:pPr>
+        <w:shd w:val="clear" w:color="auto" w:fill="FCFCFC"/>
+        <w:spacing w:before="216" w:after="84" w:line="240" w:lineRule="auto"/>
+        <w:outlineLvl w:val="1"/>
+        <w:rPr>
+          <w:rFonts w:ascii="Arial" w:eastAsia="Times New Roman" w:hAnsi="Arial" w:cs="Arial"/>
+          <w:b/>
+          <w:bCs/>
+          <w:color w:val="141414"/>
+          <w:kern w:val="0"/>
+          <w:sz w:val="32"/>
+          <w:szCs w:val="32"/>
+          <w14:ligatures w14:val="none"/>
+        </w:rPr>
+      </w:pPr>
+      <w:r>
+        <w:rPr>
+          <w:rFonts w:ascii="Arial" w:eastAsia="Times New Roman" w:hAnsi="Arial" w:cs="Arial"/>
+          <w:b/>
+          <w:bCs/>
+          <w:color w:val="141414"/>
+          <w:kern w:val="0"/>
+          <w:sz w:val="32"/>
+          <w:szCs w:val="32"/>
+          <w14:ligatures w14:val="none"/>
+        </w:rPr>
+        <w:t>The deliverable Alex named explicitly</w:t>
+      </w:r>
+    </w:p>
+    <w:p>
+      <w:pPr>
+        <w:numPr>
+          <w:ilvl w:val="0"/>
+          <w:numId w:val="7"/>
+        </w:numPr>
+        <w:shd w:val="clear" w:color="auto" w:fill="FCFCFC"/>
+        <w:spacing w:after="0" w:line="240" w:lineRule="auto"/>
+        <w:rPr>
+          <w:rFonts w:ascii="Arial" w:eastAsia="Times New Roman" w:hAnsi="Arial" w:cs="Arial"/>
+          <w:color w:val="141414"/>
+          <w:kern w:val="0"/>
+          <w:sz w:val="20"/>
+          <w:szCs w:val="20"/>
+          <w14:ligatures w14:val="none"/>
+        </w:rPr>
+      </w:pPr>
+      <w:r>
+        <w:rPr>
+          <w:rFonts w:ascii="Arial" w:eastAsia="Times New Roman" w:hAnsi="Arial" w:cs="Arial"/>
+          <w:b/>
+          <w:bCs/>
+          <w:color w:val="141414"/>
+          <w:kern w:val="0"/>
+          <w:sz w:val="20"/>
+          <w:szCs w:val="20"/>
+          <w14:ligatures w14:val="none"/>
+        </w:rPr>
+        <w:t>Fit model WITH roster pressure</w:t>
+      </w:r>
+      <w:r>
+        <w:rPr>
+          <w:rFonts w:ascii="Arial" w:eastAsia="Times New Roman" w:hAnsi="Arial" w:cs="Arial"/>
+          <w:color w:val="141414"/>
+          <w:kern w:val="0"/>
+          <w:sz w:val="20"/>
+          <w:szCs w:val="20"/>
+          <w14:ligatures w14:val="none"/>
+        </w:rPr>
+        <w:t> to the data (ability + congestion / </w:t>
+      </w:r>
+      <m:oMath>
+        <m:sSub>
+          <m:sSubPr>
+            <m:ctrlPr>
+              <w:rPr>
+                <w:rFonts w:ascii="Cambria Math" w:eastAsia="Times New Roman" w:hAnsi="Cambria Math" w:cs="Times New Roman"/>
+                <w:kern w:val="0"/>
+                <w14:ligatures w14:val="none"/>
+              </w:rPr>
+            </m:ctrlPr>
+          </m:sSubPr>
+          <m:e>
+            <m:r>
+              <w:rPr>
+                <w:rFonts w:ascii="Cambria Math" w:eastAsia="Times New Roman" w:hAnsi="Cambria Math" w:cs="Times New Roman"/>
+                <w:kern w:val="0"/>
+                <w14:ligatures w14:val="none"/>
+              </w:rPr>
+              <m:t>L</m:t>
+            </m:r>
+          </m:e>
+          <m:sub>
+            <m:r>
+              <w:rPr>
+                <w:rFonts w:ascii="Cambria Math" w:eastAsia="Times New Roman" w:hAnsi="Cambria Math" w:cs="Times New Roman"/>
+                <w:kern w:val="0"/>
+                <w14:ligatures w14:val="none"/>
+              </w:rPr>
+              <m:t>Q</m:t>
+            </m:r>
+          </m:sub>
+        </m:sSub>
+      </m:oMath>
+      <w:r>
+        <w:rPr>
+          <w:rFonts w:ascii="Arial" w:eastAsia="Times New Roman" w:hAnsi="Arial" w:cs="Arial"/>
+          <w:color w:val="141414"/>
+          <w:kern w:val="0"/>
+          <w:sz w:val="20"/>
+          <w:szCs w:val="20"/>
+          <w14:ligatures w14:val="none"/>
+        </w:rPr>
+        <w:t> in the selection score — needs an actual fit; he said </w:t>
+      </w:r>
+      <w:r>
+        <w:rPr>
+          <w:rFonts w:ascii="Arial" w:eastAsia="Times New Roman" w:hAnsi="Arial" w:cs="Arial"/>
+          <w:b/>
+          <w:bCs/>
+          <w:color w:val="141414"/>
+          <w:kern w:val="0"/>
+          <w:sz w:val="20"/>
+          <w:szCs w:val="20"/>
+          <w14:ligatures w14:val="none"/>
+        </w:rPr>
+        <w:t>“You have to give me a fit”</w:t>
+      </w:r>
+      <w:r>
+        <w:rPr>
+          <w:rFonts w:ascii="Arial" w:eastAsia="Times New Roman" w:hAnsi="Arial" w:cs="Arial"/>
+          <w:color w:val="141414"/>
+          <w:kern w:val="0"/>
+          <w:sz w:val="20"/>
+          <w:szCs w:val="20"/>
+          <w14:ligatures w14:val="none"/>
+        </w:rPr>
+        <w:t> — ventile bars alone aren’t enough).</w:t>
+      </w:r>
+    </w:p>
+    <w:p>
+      <w:pPr>
+        <w:numPr>
+          <w:ilvl w:val="0"/>
+          <w:numId w:val="7"/>
+        </w:numPr>
+        <w:shd w:val="clear" w:color="auto" w:fill="FCFCFC"/>
+        <w:spacing w:after="0" w:line="240" w:lineRule="auto"/>
+        <w:rPr>
+          <w:rFonts w:ascii="Arial" w:eastAsia="Times New Roman" w:hAnsi="Arial" w:cs="Arial"/>
+          <w:color w:val="141414"/>
+          <w:kern w:val="0"/>
+          <w:sz w:val="20"/>
+          <w:szCs w:val="20"/>
+          <w14:ligatures w14:val="none"/>
+        </w:rPr>
+      </w:pPr>
+      <w:r>
+        <w:rPr>
+          <w:rFonts w:ascii="Arial" w:eastAsia="Times New Roman" w:hAnsi="Arial" w:cs="Arial"/>
+          <w:b/>
+          <w:bCs/>
+          <w:color w:val="141414"/>
+          <w:kern w:val="0"/>
+          <w:sz w:val="20"/>
+          <w:szCs w:val="20"/>
+          <w14:ligatures w14:val="none"/>
+        </w:rPr>
+        <w:t>Fit the same setup WITH roster pressure turned off</w:t>
+      </w:r>
+      <w:r>
+        <w:rPr>
+          <w:rFonts w:ascii="Arial" w:eastAsia="Times New Roman" w:hAnsi="Arial" w:cs="Arial"/>
+          <w:color w:val="141414"/>
+          <w:kern w:val="0"/>
+          <w:sz w:val="20"/>
+          <w:szCs w:val="20"/>
+          <w14:ligatures w14:val="none"/>
+        </w:rPr>
+        <w:t> (ability-only prediction).</w:t>
+      </w:r>
+    </w:p>
+    <w:p>
+      <w:pPr>
+        <w:numPr>
+          <w:ilvl w:val="0"/>
+          <w:numId w:val="7"/>
+        </w:numPr>
+        <w:shd w:val="clear" w:color="auto" w:fill="FCFCFC"/>
+        <w:spacing w:after="0" w:line="240" w:lineRule="auto"/>
+        <w:rPr>
+          <w:rFonts w:ascii="Arial" w:eastAsia="Times New Roman" w:hAnsi="Arial" w:cs="Arial"/>
+          <w:color w:val="141414"/>
+          <w:kern w:val="0"/>
+          <w:sz w:val="20"/>
+          <w:szCs w:val="20"/>
+          <w14:ligatures w14:val="none"/>
+        </w:rPr>
+      </w:pPr>
+      <w:r>
+        <w:rPr>
+          <w:rFonts w:ascii="Arial" w:eastAsia="Times New Roman" w:hAnsi="Arial" w:cs="Arial"/>
+          <w:b/>
+          <w:bCs/>
+          <w:color w:val="141414"/>
+          <w:kern w:val="0"/>
+          <w:sz w:val="20"/>
+          <w:szCs w:val="20"/>
+          <w14:ligatures w14:val="none"/>
+        </w:rPr>
+        <w:t>Compare per-individual predicted probabilities:</w:t>
+      </w:r>
+    </w:p>
+    <w:p>
+      <w:pPr>
+        <w:numPr>
+          <w:ilvl w:val="1"/>
+          <w:numId w:val="7"/>
+        </w:numPr>
+        <w:shd w:val="clear" w:color="auto" w:fill="FCFCFC"/>
+        <w:spacing w:before="100" w:beforeAutospacing="1" w:after="100" w:afterAutospacing="1" w:line="240" w:lineRule="auto"/>
+        <w:rPr>
+          <w:rFonts w:ascii="Arial" w:eastAsia="Times New Roman" w:hAnsi="Arial" w:cs="Arial"/>
+          <w:color w:val="141414"/>
+          <w:kern w:val="0"/>
+          <w:sz w:val="20"/>
+          <w:szCs w:val="20"/>
+          <w14:ligatures w14:val="none"/>
+        </w:rPr>
+      </w:pPr>
+      <m:oMath>
+        <m:sSubSup>
+          <m:sSubSupPr>
+            <m:ctrlPr>
+              <w:rPr>
+                <w:rFonts w:ascii="Cambria Math" w:eastAsia="Times New Roman" w:hAnsi="Cambria Math" w:cs="Times New Roman"/>
+                <w:kern w:val="0"/>
+                <w14:ligatures w14:val="none"/>
+              </w:rPr>
+            </m:ctrlPr>
+          </m:sSubSupPr>
+          <m:e>
+            <m:acc>
+              <m:accPr>
+                <m:ctrlPr>
+                  <w:rPr>
+                    <w:rFonts w:ascii="Cambria Math" w:eastAsia="Times New Roman" w:hAnsi="Cambria Math" w:cs="Times New Roman"/>
+                    <w:kern w:val="0"/>
+                    <w14:ligatures w14:val="none"/>
+                  </w:rPr>
+                </m:ctrlPr>
+              </m:accPr>
+              <m:e>
+                <m:r>
+                  <w:rPr>
+                    <w:rFonts w:ascii="Cambria Math" w:eastAsia="Times New Roman" w:hAnsi="Cambria Math" w:cs="Times New Roman"/>
+                    <w:kern w:val="0"/>
+                    <w14:ligatures w14:val="none"/>
+                  </w:rPr>
+                  <m:t>p</m:t>
+                </m:r>
+              </m:e>
+            </m:acc>
+          </m:e>
+          <m:sub>
+            <m:r>
+              <w:rPr>
+                <w:rFonts w:ascii="Cambria Math" w:eastAsia="Times New Roman" w:hAnsi="Cambria Math" w:cs="Times New Roman"/>
+                <w:kern w:val="0"/>
+                <w14:ligatures w14:val="none"/>
+              </w:rPr>
+              <m:t>i</m:t>
+            </m:r>
+          </m:sub>
+          <m:sup>
+            <m:r>
+              <m:rPr>
+                <m:nor/>
+              </m:rPr>
+              <w:rPr>
+                <w:rFonts w:ascii="Times New Roman" w:eastAsia="Times New Roman" w:hAnsi="Times New Roman" w:cs="Times New Roman"/>
+                <w:kern w:val="0"/>
+                <w14:ligatures w14:val="none"/>
+              </w:rPr>
+              <m:t>full</m:t>
+            </m:r>
+          </m:sup>
+        </m:sSubSup>
+      </m:oMath>
+      <w:r>
+        <w:rPr>
+          <w:rFonts w:ascii="Arial" w:eastAsia="Times New Roman" w:hAnsi="Arial" w:cs="Arial"/>
+          <w:color w:val="141414"/>
+          <w:kern w:val="0"/>
+          <w:sz w:val="20"/>
+          <w:szCs w:val="20"/>
+          <w14:ligatures w14:val="none"/>
+        </w:rPr>
+        <w:t> = P(draft | ability + roster in score)</w:t>
+      </w:r>
+    </w:p>
+    <w:p>
+      <w:pPr>
+        <w:numPr>
+          <w:ilvl w:val="1"/>
+          <w:numId w:val="7"/>
+        </w:numPr>
+        <w:shd w:val="clear" w:color="auto" w:fill="FCFCFC"/>
+        <w:spacing w:before="100" w:beforeAutospacing="1" w:after="100" w:afterAutospacing="1" w:line="240" w:lineRule="auto"/>
+        <w:rPr>
+          <w:rFonts w:ascii="Arial" w:eastAsia="Times New Roman" w:hAnsi="Arial" w:cs="Arial"/>
+          <w:color w:val="141414"/>
+          <w:kern w:val="0"/>
+          <w:sz w:val="20"/>
+          <w:szCs w:val="20"/>
+          <w14:ligatures w14:val="none"/>
+        </w:rPr>
+      </w:pPr>
+      <m:oMath>
+        <m:sSubSup>
+          <m:sSubSupPr>
+            <m:ctrlPr>
+              <w:rPr>
+                <w:rFonts w:ascii="Cambria Math" w:eastAsia="Times New Roman" w:hAnsi="Cambria Math" w:cs="Times New Roman"/>
+                <w:kern w:val="0"/>
+                <w14:ligatures w14:val="none"/>
+              </w:rPr>
+            </m:ctrlPr>
+          </m:sSubSupPr>
+          <m:e>
+            <m:acc>
+              <m:accPr>
+                <m:ctrlPr>
+                  <w:rPr>
+                    <w:rFonts w:ascii="Cambria Math" w:eastAsia="Times New Roman" w:hAnsi="Cambria Math" w:cs="Times New Roman"/>
+                    <w:kern w:val="0"/>
+                    <w14:ligatures w14:val="none"/>
+                  </w:rPr>
+                </m:ctrlPr>
+              </m:accPr>
+              <m:e>
+                <m:r>
+                  <w:rPr>
+                    <w:rFonts w:ascii="Cambria Math" w:eastAsia="Times New Roman" w:hAnsi="Cambria Math" w:cs="Times New Roman"/>
+                    <w:kern w:val="0"/>
+                    <w14:ligatures w14:val="none"/>
+                  </w:rPr>
+                  <m:t>p</m:t>
+                </m:r>
+              </m:e>
+            </m:acc>
+          </m:e>
+          <m:sub>
+            <m:r>
+              <w:rPr>
+                <w:rFonts w:ascii="Cambria Math" w:eastAsia="Times New Roman" w:hAnsi="Cambria Math" w:cs="Times New Roman"/>
+                <w:kern w:val="0"/>
+                <w14:ligatures w14:val="none"/>
+              </w:rPr>
+              <m:t>i</m:t>
+            </m:r>
+          </m:sub>
+          <m:sup>
+            <m:r>
+              <m:rPr>
+                <m:nor/>
+              </m:rPr>
+              <w:rPr>
+                <w:rFonts w:ascii="Times New Roman" w:eastAsia="Times New Roman" w:hAnsi="Times New Roman" w:cs="Times New Roman"/>
+                <w:kern w:val="0"/>
+                <w14:ligatures w14:val="none"/>
+              </w:rPr>
+              <m:t>ability</m:t>
+            </m:r>
+          </m:sup>
+        </m:sSubSup>
+      </m:oMath>
+      <w:r>
+        <w:rPr>
+          <w:rFonts w:ascii="Arial" w:eastAsia="Times New Roman" w:hAnsi="Arial" w:cs="Arial"/>
+          <w:color w:val="141414"/>
+          <w:kern w:val="0"/>
+          <w:sz w:val="20"/>
+          <w:szCs w:val="20"/>
+          <w14:ligatures w14:val="none"/>
+        </w:rPr>
+        <w:t> = P(draft | ability only)</w:t>
+      </w:r>
+    </w:p>
+    <w:p>
+      <w:pPr>
+        <w:numPr>
+          <w:ilvl w:val="0"/>
+          <w:numId w:val="7"/>
+        </w:numPr>
+        <w:shd w:val="clear" w:color="auto" w:fill="FCFCFC"/>
+        <w:spacing w:after="0" w:line="240" w:lineRule="auto"/>
+        <w:rPr>
+          <w:rFonts w:ascii="Arial" w:eastAsia="Times New Roman" w:hAnsi="Arial" w:cs="Arial"/>
+          <w:color w:val="141414"/>
+          <w:kern w:val="0"/>
+          <w:sz w:val="20"/>
+          <w:szCs w:val="20"/>
+          <w14:ligatures w14:val="none"/>
+        </w:rPr>
+      </w:pPr>
+      <w:r>
+        <w:rPr>
+          <w:rFonts w:ascii="Arial" w:eastAsia="Times New Roman" w:hAnsi="Arial" w:cs="Arial"/>
+          <w:b/>
+          <w:bCs/>
+          <w:color w:val="141414"/>
+          <w:kern w:val="0"/>
+          <w:sz w:val="20"/>
+          <w:szCs w:val="20"/>
+          <w14:ligatures w14:val="none"/>
+        </w:rPr>
+        <w:t>Ask how big the gap is:</w:t>
+      </w:r>
+    </w:p>
+    <w:p>
+      <w:pPr>
+        <w:numPr>
+          <w:ilvl w:val="1"/>
+          <w:numId w:val="7"/>
+        </w:numPr>
+        <w:shd w:val="clear" w:color="auto" w:fill="FCFCFC"/>
+        <w:spacing w:before="100" w:beforeAutospacing="1" w:after="100" w:afterAutospacing="1" w:line="240" w:lineRule="auto"/>
+        <w:rPr>
+          <w:rFonts w:ascii="Arial" w:eastAsia="Times New Roman" w:hAnsi="Arial" w:cs="Arial"/>
+          <w:color w:val="141414"/>
+          <w:kern w:val="0"/>
+          <w:sz w:val="20"/>
+          <w:szCs w:val="20"/>
+          <w14:ligatures w14:val="none"/>
+        </w:rPr>
+      </w:pPr>
+      <w:r>
+        <w:rPr>
+          <w:rFonts w:ascii="Arial" w:eastAsia="Times New Roman" w:hAnsi="Arial" w:cs="Arial"/>
+          <w:color w:val="141414"/>
+          <w:kern w:val="0"/>
+          <w:sz w:val="20"/>
+          <w:szCs w:val="20"/>
+          <w14:ligatures w14:val="none"/>
+        </w:rPr>
+        <w:t>Overall: “Does roster add ~10% predictive capacity?”</w:t>
+      </w:r>
+    </w:p>
+    <w:p>
+      <w:pPr>
+        <w:numPr>
+          <w:ilvl w:val="1"/>
+          <w:numId w:val="7"/>
+        </w:numPr>
+        <w:shd w:val="clear" w:color="auto" w:fill="FCFCFC"/>
+        <w:spacing w:before="100" w:beforeAutospacing="1" w:after="100" w:afterAutospacing="1" w:line="240" w:lineRule="auto"/>
+        <w:rPr>
+          <w:rFonts w:ascii="Arial" w:eastAsia="Times New Roman" w:hAnsi="Arial" w:cs="Arial"/>
+          <w:color w:val="141414"/>
+          <w:kern w:val="0"/>
+          <w:sz w:val="20"/>
+          <w:szCs w:val="20"/>
+          <w14:ligatures w14:val="none"/>
+        </w:rPr>
+      </w:pPr>
+      <w:r>
+        <w:rPr>
+          <w:rFonts w:ascii="Arial" w:eastAsia="Times New Roman" w:hAnsi="Arial" w:cs="Arial"/>
+          <w:b/>
+          <w:bCs/>
+          <w:color w:val="141414"/>
+          <w:kern w:val="0"/>
+          <w:sz w:val="20"/>
+          <w:szCs w:val="20"/>
+          <w14:ligatures w14:val="none"/>
+        </w:rPr>
+        <w:t>Ability-dependent error:</w:t>
+      </w:r>
+      <w:r>
+        <w:rPr>
+          <w:rFonts w:ascii="Arial" w:eastAsia="Times New Roman" w:hAnsi="Arial" w:cs="Arial"/>
+          <w:color w:val="141414"/>
+          <w:kern w:val="0"/>
+          <w:sz w:val="20"/>
+          <w:szCs w:val="20"/>
+          <w14:ligatures w14:val="none"/>
+        </w:rPr>
+        <w:t> Alex suspects overall accuracy may look similar, but </w:t>
+      </w:r>
+      <w:r>
+        <w:rPr>
+          <w:rFonts w:ascii="Arial" w:eastAsia="Times New Roman" w:hAnsi="Arial" w:cs="Arial"/>
+          <w:b/>
+          <w:bCs/>
+          <w:color w:val="141414"/>
+          <w:kern w:val="0"/>
+          <w:sz w:val="20"/>
+          <w:szCs w:val="20"/>
+          <w14:ligatures w14:val="none"/>
+        </w:rPr>
+        <w:t>error is biggest at the top</w:t>
+      </w:r>
+      <w:r>
+        <w:rPr>
+          <w:rFonts w:ascii="Arial" w:eastAsia="Times New Roman" w:hAnsi="Arial" w:cs="Arial"/>
+          <w:color w:val="141414"/>
+          <w:kern w:val="0"/>
+          <w:sz w:val="20"/>
+          <w:szCs w:val="20"/>
+          <w14:ligatures w14:val="none"/>
+        </w:rPr>
+        <w:t> — knowing roster effects helps most for elite players.</w:t>
+      </w:r>
+    </w:p>
+    <w:p>
+      <w:pPr>
+        <w:numPr>
+          <w:ilvl w:val="1"/>
+          <w:numId w:val="7"/>
+        </w:numPr>
+        <w:shd w:val="clear" w:color="auto" w:fill="FCFCFC"/>
+        <w:spacing w:before="100" w:beforeAutospacing="1" w:after="100" w:afterAutospacing="1" w:line="240" w:lineRule="auto"/>
+        <w:rPr>
+          <w:rFonts w:ascii="Arial" w:eastAsia="Times New Roman" w:hAnsi="Arial" w:cs="Arial"/>
+          <w:color w:val="141414"/>
+          <w:kern w:val="0"/>
+          <w:sz w:val="20"/>
+          <w:szCs w:val="20"/>
+          <w14:ligatures w14:val="none"/>
+        </w:rPr>
+      </w:pPr>
+      <w:r>
+        <w:rPr>
+          <w:rFonts w:ascii="Arial" w:eastAsia="Times New Roman" w:hAnsi="Arial" w:cs="Arial"/>
+          <w:b/>
+          <w:bCs/>
+          <w:color w:val="141414"/>
+          <w:kern w:val="0"/>
+          <w:sz w:val="20"/>
+          <w:szCs w:val="20"/>
+          <w14:ligatures w14:val="none"/>
+        </w:rPr>
+        <w:t>Carrying capacity (K, λ):</w:t>
+      </w:r>
+      <w:r>
+        <w:rPr>
+          <w:rFonts w:ascii="Arial" w:eastAsia="Times New Roman" w:hAnsi="Arial" w:cs="Arial"/>
+          <w:color w:val="141414"/>
+          <w:kern w:val="0"/>
+          <w:sz w:val="20"/>
+          <w:szCs w:val="20"/>
+          <w14:ligatures w14:val="none"/>
+        </w:rPr>
+        <w:t> few slots (NBA draft) → roster pressure may </w:t>
+      </w:r>
+      <w:r>
+        <w:rPr>
+          <w:rFonts w:ascii="Arial" w:eastAsia="Times New Roman" w:hAnsi="Arial" w:cs="Arial"/>
+          <w:b/>
+          <w:bCs/>
+          <w:color w:val="141414"/>
+          <w:kern w:val="0"/>
+          <w:sz w:val="20"/>
+          <w:szCs w:val="20"/>
+          <w14:ligatures w14:val="none"/>
+        </w:rPr>
+        <w:t>crush</w:t>
+      </w:r>
+      <w:r>
+        <w:rPr>
+          <w:rFonts w:ascii="Arial" w:eastAsia="Times New Roman" w:hAnsi="Arial" w:cs="Arial"/>
+          <w:color w:val="141414"/>
+          <w:kern w:val="0"/>
+          <w:sz w:val="20"/>
+          <w:szCs w:val="20"/>
+          <w14:ligatures w14:val="none"/>
+        </w:rPr>
+        <w:t> predictions at the top; many slots → rounding error.</w:t>
+      </w:r>
+    </w:p>
+    <w:p>
+      <w:pPr>
+        <w:shd w:val="clear" w:color="auto" w:fill="FCFCFC"/>
+        <w:spacing w:before="120" w:after="120" w:line="240" w:lineRule="auto"/>
+        <w:rPr>
+          <w:rFonts w:ascii="Arial" w:eastAsia="Times New Roman" w:hAnsi="Arial" w:cs="Arial"/>
+          <w:color w:val="141414"/>
+          <w:kern w:val="0"/>
+          <w:sz w:val="20"/>
+          <w:szCs w:val="20"/>
+          <w14:ligatures w14:val="none"/>
+        </w:rPr>
+      </w:pPr>
+      <w:r>
+        <w:rPr>
+          <w:rFonts w:ascii="Arial" w:eastAsia="Times New Roman" w:hAnsi="Arial" w:cs="Arial"/>
+          <w:color w:val="141414"/>
+          <w:kern w:val="0"/>
+          <w:sz w:val="20"/>
+          <w:szCs w:val="20"/>
+          <w14:ligatures w14:val="none"/>
+        </w:rPr>
+        <w:t>So the question is </w:t>
+      </w:r>
+      <w:r>
+        <w:rPr>
+          <w:rFonts w:ascii="Arial" w:eastAsia="Times New Roman" w:hAnsi="Arial" w:cs="Arial"/>
+          <w:b/>
+          <w:bCs/>
+          <w:color w:val="141414"/>
+          <w:kern w:val="0"/>
+          <w:sz w:val="20"/>
+          <w:szCs w:val="20"/>
+          <w14:ligatures w14:val="none"/>
+        </w:rPr>
+        <w:t>predictive importance</w:t>
+      </w:r>
+      <w:r>
+        <w:rPr>
+          <w:rFonts w:ascii="Arial" w:eastAsia="Times New Roman" w:hAnsi="Arial" w:cs="Arial"/>
+          <w:color w:val="141414"/>
+          <w:kern w:val="0"/>
+          <w:sz w:val="20"/>
+          <w:szCs w:val="20"/>
+          <w14:ligatures w14:val="none"/>
+        </w:rPr>
+        <w:t>, not primarily “how many pp did roster cost player X in welfare terms” — though those connect.</w:t>
+      </w:r>
+    </w:p>
+    <w:p>
+      <w:pPr>
+        <w:spacing w:before="240" w:after="240" w:line="240" w:lineRule="auto"/>
+        <w:rPr>
+          <w:rFonts w:ascii="Arial" w:eastAsia="Times New Roman" w:hAnsi="Arial" w:cs="Arial"/>
+          <w:kern w:val="0"/>
+          <w:sz w:val="20"/>
+          <w:szCs w:val="20"/>
+          <w14:ligatures w14:val="none"/>
+        </w:rPr>
+      </w:pPr>
+      <w:r>
+        <w:rPr>
+          <w:noProof/>
+        </w:rPr>
+      </w:r>
+      <w:r>
+        <w:pict w14:anchorId="34F9CDD7">
+          <v:rect id="Horizontal Line 12" o:spid="_x0000_s1029" style="width:540pt;height:.1pt;visibility:visible;mso-wrap-style:square;mso-left-percent:-10001;mso-top-percent:-10001;mso-position-horizontal:absolute;mso-position-horizontal-relative:char;mso-position-vertical:absolute;mso-position-vertical-relative:line;mso-left-percent:-10001;mso-top-percent:-10001;v-text-anchor:top" o:gfxdata="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" filled="f">
+            <o:lock v:ext="edit" rotation="t" aspectratio="t" verticies="t" text="t" shapetype="t"/>
+            <w10:anchorlock/>
+          </v:rect>
+        </w:pict>
+      </w:r>
+    </w:p>
+    <w:p>
+      <w:pPr>
+        <w:shd w:val="clear" w:color="auto" w:fill="FCFCFC"/>
+        <w:spacing w:before="216" w:after="84" w:line="240" w:lineRule="auto"/>
+        <w:outlineLvl w:val="1"/>
+        <w:rPr>
+          <w:rFonts w:ascii="Arial" w:eastAsia="Times New Roman" w:hAnsi="Arial" w:cs="Arial"/>
+          <w:b/>
+          <w:bCs/>
+          <w:color w:val="141414"/>
+          <w:kern w:val="0"/>
+          <w:sz w:val="32"/>
+          <w:szCs w:val="32"/>
+          <w14:ligatures w14:val="none"/>
+        </w:rPr>
+      </w:pPr>
+      <w:r>
+        <w:rPr>
+          <w:rFonts w:ascii="Arial" w:eastAsia="Times New Roman" w:hAnsi="Arial" w:cs="Arial"/>
+          <w:b/>
+          <w:bCs/>
+          <w:color w:val="141414"/>
+          <w:kern w:val="0"/>
+          <w:sz w:val="32"/>
+          <w:szCs w:val="32"/>
+          <w14:ligatures w14:val="none"/>
+        </w:rPr>
+        <w:t>How this maps to what you already have</w:t>
+      </w:r>
+    </w:p>
+    <w:tbl>
+      <w:tblPr>
+        <w:tblW w:w="0" w:type="auto"/>
+        <w:tblCellMar>
+          <w:top w:w="15" w:type="dxa"/>
+          <w:left w:w="15" w:type="dxa"/>
+          <w:bottom w:w="15" w:type="dxa"/>
+          <w:right w:w="15" w:type="dxa"/>
+        </w:tblCellMar>
+        <w:tblLook w:val="04A0" w:firstRow="1" w:lastRow="0" w:firstColumn="1" w:lastColumn="0" w:noHBand="0" w:noVBand="1"/>
+      </w:tblPr>
+      <w:tblGrid>
+        <w:gridCol w:w="4707"/>
+        <w:gridCol w:w="6093"/>
+      </w:tblGrid>
+      <w:tr>
+        <w:trPr>
+          <w:tblHeader/>
+        </w:trPr>
+        <w:tc>
+          <w:tcPr>
+            <w:tcW w:w="0" w:type="auto"/>
+            <w:noWrap/>
+            <w:tcMar>
+              <w:top w:w="75" w:type="dxa"/>
+              <w:left w:w="135" w:type="dxa"/>
+              <w:bottom w:w="75" w:type="dxa"/>
+              <w:right w:w="135" w:type="dxa"/>
+            </w:tcMar>
+            <w:hideMark/>
+          </w:tcPr>
+          <w:p>
+            <w:pPr>
+              <w:spacing w:after="0" w:line="240" w:lineRule="auto"/>
+              <w:rPr>
+                <w:rFonts w:ascii="Times New Roman" w:eastAsia="Times New Roman" w:hAnsi="Times New Roman" w:cs="Times New Roman"/>
+                <w:b/>
+                <w:bCs/>
+                <w:kern w:val="0"/>
+                <w14:ligatures w14:val="none"/>
+              </w:rPr>
+            </w:pPr>
+            <w:r>
+              <w:rPr>
+                <w:rFonts w:ascii="Times New Roman" w:eastAsia="Times New Roman" w:hAnsi="Times New Roman" w:cs="Times New Roman"/>
+                <w:b/>
+                <w:bCs/>
+                <w:kern w:val="0"/>
+                <w14:ligatures w14:val="none"/>
+              </w:rPr>
+              <w:t>What you have</w:t>
+            </w:r>
+          </w:p>
+        </w:tc>
+        <w:tc>
+          <w:tcPr>
+            <w:tcW w:w="0" w:type="auto"/>
+            <w:noWrap/>
+            <w:tcMar>
+              <w:top w:w="75" w:type="dxa"/>
+              <w:left w:w="135" w:type="dxa"/>
+              <w:bottom w:w="75" w:type="dxa"/>
+              <w:right w:w="135" w:type="dxa"/>
+            </w:tcMar>
+            <w:hideMark/>
+          </w:tcPr>
+          <w:p>
+            <w:pPr>
+              <w:spacing w:after="0" w:line="240" w:lineRule="auto"/>
+              <w:rPr>
+                <w:rFonts w:ascii="Times New Roman" w:eastAsia="Times New Roman" w:hAnsi="Times New Roman" w:cs="Times New Roman"/>
+                <w:b/>
+                <w:bCs/>
+                <w:kern w:val="0"/>
+                <w14:ligatures w14:val="none"/>
+              </w:rPr>
+            </w:pPr>
+            <w:r>
+              <w:rPr>
+                <w:rFonts w:ascii="Times New Roman" w:eastAsia="Times New Roman" w:hAnsi="Times New Roman" w:cs="Times New Roman"/>
+                <w:b/>
+                <w:bCs/>
+                <w:kern w:val="0"/>
+                <w14:ligatures w14:val="none"/>
+              </w:rPr>
+              <w:t>What Alex wants next</w:t>
+            </w:r>
+          </w:p>
+        </w:tc>
+      </w:tr>
+      <w:tr>
+        <w:tc>
+          <w:tcPr>
+            <w:tcW w:w="0" w:type="auto"/>
+            <w:tcMar>
+              <w:top w:w="75" w:type="dxa"/>
+              <w:left w:w="135" w:type="dxa"/>
+              <w:bottom w:w="75" w:type="dxa"/>
+              <w:right w:w="135" w:type="dxa"/>
+            </w:tcMar>
+            <w:hideMark/>
+          </w:tcPr>
+          <w:p>
+            <w:pPr>
+              <w:spacing w:after="0" w:line="240" w:lineRule="auto"/>
+              <w:rPr>
+                <w:rFonts w:ascii="Times New Roman" w:eastAsia="Times New Roman" w:hAnsi="Times New Roman" w:cs="Times New Roman"/>
+                <w:kern w:val="0"/>
+                <w14:ligatures w14:val="none"/>
+              </w:rPr>
+            </w:pPr>
+            <w:r>
+              <w:rPr>
+                <w:rFonts w:ascii="Times New Roman" w:eastAsia="Times New Roman" w:hAnsi="Times New Roman" w:cs="Times New Roman"/>
+                <w:kern w:val="0"/>
+                <w14:ligatures w14:val="none"/>
+              </w:rPr>
+              <w:t>Hero ventile plot + LPM </w:t>
+            </w:r>
+            <w:r>
+              <w:rPr>
+                <w:rFonts w:ascii="Menlo" w:eastAsia="Times New Roman" w:hAnsi="Menlo" w:cs="Menlo"/>
+                <w:color w:val="141414"/>
+                <w:kern w:val="0"/>
+                <w:sz w:val="22"/>
+                <w:szCs w:val="22"/>
+                <w14:ligatures w14:val="none"/>
+              </w:rPr>
+              <w:t>Y ~ poolq_loo + poolq_sq</w:t>
+            </w:r>
+          </w:p>
+        </w:tc>
+        <w:tc>
+          <w:tcPr>
+            <w:tcW w:w="0" w:type="auto"/>
+            <w:tcMar>
+              <w:top w:w="75" w:type="dxa"/>
+              <w:left w:w="135" w:type="dxa"/>
+              <w:bottom w:w="75" w:type="dxa"/>
+              <w:right w:w="135" w:type="dxa"/>
+            </w:tcMar>
+            <w:hideMark/>
+          </w:tcPr>
+          <w:p>
+            <w:pPr>
+              <w:spacing w:after="0" w:line="240" w:lineRule="auto"/>
+              <w:rPr>
+                <w:rFonts w:ascii="Times New Roman" w:eastAsia="Times New Roman" w:hAnsi="Times New Roman" w:cs="Times New Roman"/>
+                <w:kern w:val="0"/>
+                <w14:ligatures w14:val="none"/>
+              </w:rPr>
+            </w:pPr>
+            <w:r>
+              <w:rPr>
+                <w:rFonts w:ascii="Times New Roman" w:eastAsia="Times New Roman" w:hAnsi="Times New Roman" w:cs="Times New Roman"/>
+                <w:b/>
+                <w:bCs/>
+                <w:kern w:val="0"/>
+                <w14:ligatures w14:val="none"/>
+              </w:rPr>
+              <w:t>Two fitted models</w:t>
+            </w:r>
+            <w:r>
+              <w:rPr>
+                <w:rFonts w:ascii="Times New Roman" w:eastAsia="Times New Roman" w:hAnsi="Times New Roman" w:cs="Times New Roman"/>
+                <w:kern w:val="0"/>
+                <w14:ligatures w14:val="none"/>
+              </w:rPr>
+              <w:t> on micro rows with ability + roster terms vs ability only</w:t>
+            </w:r>
+          </w:p>
+        </w:tc>
+      </w:tr>
+      <w:tr>
+        <w:tc>
+          <w:tcPr>
+            <w:tcW w:w="0" w:type="auto"/>
+            <w:tcMar>
+              <w:top w:w="75" w:type="dxa"/>
+              <w:left w:w="135" w:type="dxa"/>
+              <w:bottom w:w="75" w:type="dxa"/>
+              <w:right w:w="135" w:type="dxa"/>
+            </w:tcMar>
+            <w:hideMark/>
+          </w:tcPr>
+          <w:p>
+            <w:pPr>
+              <w:spacing w:after="0" w:line="240" w:lineRule="auto"/>
+              <w:rPr>
+                <w:rFonts w:ascii="Times New Roman" w:eastAsia="Times New Roman" w:hAnsi="Times New Roman" w:cs="Times New Roman"/>
+                <w:kern w:val="0"/>
+                <w14:ligatures w14:val="none"/>
+              </w:rPr>
+            </w:pPr>
+            <w:r>
+              <w:rPr>
+                <w:rFonts w:ascii="Times New Roman" w:eastAsia="Times New Roman" w:hAnsi="Times New Roman" w:cs="Times New Roman"/>
+                <w:kern w:val="0"/>
+                <w14:ligatures w14:val="none"/>
+              </w:rPr>
+              <w:t>Pass A generative (λ=0 vs λ&gt;0)</w:t>
+            </w:r>
+          </w:p>
+        </w:tc>
+        <w:tc>
+          <w:tcPr>
+            <w:tcW w:w="0" w:type="auto"/>
+            <w:tcMar>
+              <w:top w:w="75" w:type="dxa"/>
+              <w:left w:w="135" w:type="dxa"/>
+              <w:bottom w:w="75" w:type="dxa"/>
+              <w:right w:w="135" w:type="dxa"/>
+            </w:tcMar>
+            <w:hideMark/>
+          </w:tcPr>
+          <w:p>
+            <w:pPr>
+              <w:spacing w:after="0" w:line="240" w:lineRule="auto"/>
+              <w:rPr>
+                <w:rFonts w:ascii="Times New Roman" w:eastAsia="Times New Roman" w:hAnsi="Times New Roman" w:cs="Times New Roman"/>
+                <w:kern w:val="0"/>
+                <w14:ligatures w14:val="none"/>
+              </w:rPr>
+            </w:pPr>
+            <w:r>
+              <w:rPr>
+                <w:rFonts w:ascii="Times New Roman" w:eastAsia="Times New Roman" w:hAnsi="Times New Roman" w:cs="Times New Roman"/>
+                <w:b/>
+                <w:bCs/>
+                <w:kern w:val="0"/>
+                <w14:ligatures w14:val="none"/>
+              </w:rPr>
+              <w:t>Empirical analogue:</w:t>
+            </w:r>
+            <w:r>
+              <w:rPr>
+                <w:rFonts w:ascii="Times New Roman" w:eastAsia="Times New Roman" w:hAnsi="Times New Roman" w:cs="Times New Roman"/>
+                <w:kern w:val="0"/>
+                <w14:ligatures w14:val="none"/>
+              </w:rPr>
+              <w:t> turn off roster in the </w:t>
+            </w:r>
+            <w:r>
+              <w:rPr>
+                <w:rFonts w:ascii="Times New Roman" w:eastAsia="Times New Roman" w:hAnsi="Times New Roman" w:cs="Times New Roman"/>
+                <w:b/>
+                <w:bCs/>
+                <w:kern w:val="0"/>
+                <w14:ligatures w14:val="none"/>
+              </w:rPr>
+              <w:t>prediction</w:t>
+            </w:r>
+            <w:r>
+              <w:rPr>
+                <w:rFonts w:ascii="Times New Roman" w:eastAsia="Times New Roman" w:hAnsi="Times New Roman" w:cs="Times New Roman"/>
+                <w:kern w:val="0"/>
+                <w14:ligatures w14:val="none"/>
+              </w:rPr>
+              <w:t> model, compare </w:t>
+            </w:r>
+            <m:oMath>
+              <m:acc>
+                <m:accPr>
+                  <m:ctrlPr>
+                    <w:rPr>
+                      <w:rFonts w:ascii="Cambria Math" w:eastAsia="Times New Roman" w:hAnsi="Cambria Math" w:cs="Times New Roman"/>
+                      <w:kern w:val="0"/>
+                      <w14:ligatures w14:val="none"/>
+                    </w:rPr>
+                  </m:ctrlPr>
+                </m:accPr>
+                <m:e>
+                  <m:r>
+                    <w:rPr>
+                      <w:rFonts w:ascii="Cambria Math" w:eastAsia="Times New Roman" w:hAnsi="Cambria Math" w:cs="Times New Roman"/>
+                      <w:kern w:val="0"/>
+                      <w14:ligatures w14:val="none"/>
+                    </w:rPr>
+                    <m:t>p</m:t>
+                  </m:r>
+                </m:e>
+              </m:acc>
+            </m:oMath>
+          </w:p>
+        </w:tc>
+      </w:tr>
+      <w:tr>
+        <w:tc>
+          <w:tcPr>
+            <w:tcW w:w="0" w:type="auto"/>
+            <w:tcMar>
+              <w:top w:w="75" w:type="dxa"/>
+              <w:left w:w="135" w:type="dxa"/>
+              <w:bottom w:w="75" w:type="dxa"/>
+              <w:right w:w="135" w:type="dxa"/>
+            </w:tcMar>
+            <w:hideMark/>
+          </w:tcPr>
+          <w:p>
+            <w:pPr>
+              <w:spacing w:after="0" w:line="240" w:lineRule="auto"/>
+              <w:rPr>
+                <w:rFonts w:ascii="Times New Roman" w:eastAsia="Times New Roman" w:hAnsi="Times New Roman" w:cs="Times New Roman"/>
+                <w:kern w:val="0"/>
+                <w14:ligatures w14:val="none"/>
+              </w:rPr>
+            </w:pPr>
+            <w:r>
+              <w:rPr>
+                <w:rFonts w:ascii="Times New Roman" w:eastAsia="Times New Roman" w:hAnsi="Times New Roman" w:cs="Times New Roman"/>
+                <w:kern w:val="0"/>
+                <w14:ligatures w14:val="none"/>
+              </w:rPr>
+              <w:t>Pass B (ρ)</w:t>
+            </w:r>
+          </w:p>
+        </w:tc>
+        <w:tc>
+          <w:tcPr>
+            <w:tcW w:w="0" w:type="auto"/>
+            <w:tcMar>
+              <w:top w:w="75" w:type="dxa"/>
+              <w:left w:w="135" w:type="dxa"/>
+              <w:bottom w:w="75" w:type="dxa"/>
+              <w:right w:w="135" w:type="dxa"/>
+            </w:tcMar>
+            <w:hideMark/>
+          </w:tcPr>
+          <w:p>
+            <w:pPr>
+              <w:spacing w:after="0" w:line="240" w:lineRule="auto"/>
+              <w:rPr>
+                <w:rFonts w:ascii="Times New Roman" w:eastAsia="Times New Roman" w:hAnsi="Times New Roman" w:cs="Times New Roman"/>
+                <w:kern w:val="0"/>
+                <w14:ligatures w14:val="none"/>
+              </w:rPr>
+            </w:pPr>
+            <w:r>
+              <w:rPr>
+                <w:rFonts w:ascii="Times New Roman" w:eastAsia="Times New Roman" w:hAnsi="Times New Roman" w:cs="Times New Roman"/>
+                <w:kern w:val="0"/>
+                <w14:ligatures w14:val="none"/>
+              </w:rPr>
+              <w:t>Less central here; Alex is on </w:t>
+            </w:r>
+            <w:r>
+              <w:rPr>
+                <w:rFonts w:ascii="Times New Roman" w:eastAsia="Times New Roman" w:hAnsi="Times New Roman" w:cs="Times New Roman"/>
+                <w:b/>
+                <w:bCs/>
+                <w:kern w:val="0"/>
+                <w14:ligatures w14:val="none"/>
+              </w:rPr>
+              <w:t>score/selection channel</w:t>
+            </w:r>
+            <w:r>
+              <w:rPr>
+                <w:rFonts w:ascii="Times New Roman" w:eastAsia="Times New Roman" w:hAnsi="Times New Roman" w:cs="Times New Roman"/>
+                <w:kern w:val="0"/>
+                <w14:ligatures w14:val="none"/>
+              </w:rPr>
+              <w:t>, not assignment</w:t>
+            </w:r>
+          </w:p>
+        </w:tc>
+      </w:tr>
+    </w:tbl>
+    <w:p>
+      <w:pPr>
+        <w:shd w:val="clear" w:color="auto" w:fill="FCFCFC"/>
+        <w:spacing w:before="120" w:after="120" w:line="240" w:lineRule="auto"/>
+        <w:rPr>
+          <w:rFonts w:ascii="Arial" w:eastAsia="Times New Roman" w:hAnsi="Arial" w:cs="Arial"/>
+          <w:color w:val="141414"/>
+          <w:kern w:val="0"/>
+          <w:sz w:val="20"/>
+          <w:szCs w:val="20"/>
+          <w14:ligatures w14:val="none"/>
+        </w:rPr>
+      </w:pPr>
+      <w:r>
+        <w:rPr>
+          <w:rFonts w:ascii="Arial" w:eastAsia="Times New Roman" w:hAnsi="Arial" w:cs="Arial"/>
+          <w:color w:val="141414"/>
+          <w:kern w:val="0"/>
+          <w:sz w:val="20"/>
+          <w:szCs w:val="20"/>
+          <w14:ligatures w14:val="none"/>
+        </w:rPr>
+        <w:t>The hero plot is </w:t>
+      </w:r>
+      <w:r>
+        <w:rPr>
+          <w:rFonts w:ascii="Arial" w:eastAsia="Times New Roman" w:hAnsi="Arial" w:cs="Arial"/>
+          <w:b/>
+          <w:bCs/>
+          <w:color w:val="141414"/>
+          <w:kern w:val="0"/>
+          <w:sz w:val="20"/>
+          <w:szCs w:val="20"/>
+          <w14:ligatures w14:val="none"/>
+        </w:rPr>
+        <w:t>descriptive</w:t>
+      </w:r>
+      <w:r>
+        <w:rPr>
+          <w:rFonts w:ascii="Arial" w:eastAsia="Times New Roman" w:hAnsi="Arial" w:cs="Arial"/>
+          <w:color w:val="141414"/>
+          <w:kern w:val="0"/>
+          <w:sz w:val="20"/>
+          <w:szCs w:val="20"/>
+          <w14:ligatures w14:val="none"/>
+        </w:rPr>
+        <w:t>. Alex wants </w:t>
+      </w:r>
+      <w:r>
+        <w:rPr>
+          <w:rFonts w:ascii="Arial" w:eastAsia="Times New Roman" w:hAnsi="Arial" w:cs="Arial"/>
+          <w:b/>
+          <w:bCs/>
+          <w:color w:val="141414"/>
+          <w:kern w:val="0"/>
+          <w:sz w:val="20"/>
+          <w:szCs w:val="20"/>
+          <w14:ligatures w14:val="none"/>
+        </w:rPr>
+        <w:t>predictive model comparison</w:t>
+      </w:r>
+      <w:r>
+        <w:rPr>
+          <w:rFonts w:ascii="Arial" w:eastAsia="Times New Roman" w:hAnsi="Arial" w:cs="Arial"/>
+          <w:color w:val="141414"/>
+          <w:kern w:val="0"/>
+          <w:sz w:val="20"/>
+          <w:szCs w:val="20"/>
+          <w14:ligatures w14:val="none"/>
+        </w:rPr>
+        <w:t> — closer to ML / forecasting than to “difference between two binned curves overlaid.”</w:t>
+      </w:r>
+    </w:p>
+    <w:p>
+      <w:pPr>
+        <w:spacing w:before="240" w:after="240" w:line="240" w:lineRule="auto"/>
+        <w:rPr>
+          <w:rFonts w:ascii="Arial" w:eastAsia="Times New Roman" w:hAnsi="Arial" w:cs="Arial"/>
+          <w:kern w:val="0"/>
+          <w:sz w:val="20"/>
+          <w:szCs w:val="20"/>
+          <w14:ligatures w14:val="none"/>
+        </w:rPr>
+      </w:pPr>
+      <w:r>
+        <w:rPr>
+          <w:noProof/>
+        </w:rPr>
+      </w:r>
+      <w:r>
+        <w:pict w14:anchorId="0D8A623F">
+          <v:rect id="Horizontal Line 13" o:spid="_x0000_s1028" style="width:540pt;height:.1pt;visibility:visible;mso-wrap-style:square;mso-left-percent:-10001;mso-top-percent:-10001;mso-position-horizontal:absolute;mso-position-horizontal-relative:char;mso-position-vertical:absolute;mso-position-vertical-relative:line;mso-left-percent:-10001;mso-top-percent:-10001;v-text-anchor:top" o:gfxdata="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" filled="f">
+            <o:lock v:ext="edit" rotation="t" aspectratio="t" verticies="t" text="t" shapetype="t"/>
+            <w10:anchorlock/>
+          </v:rect>
+        </w:pict>
+      </w:r>
+    </w:p>
+    <w:p>
+      <w:pPr>
+        <w:shd w:val="clear" w:color="auto" w:fill="FCFCFC"/>
+        <w:spacing w:before="216" w:after="84" w:line="240" w:lineRule="auto"/>
+        <w:outlineLvl w:val="1"/>
+        <w:rPr>
+          <w:rFonts w:ascii="Arial" w:eastAsia="Times New Roman" w:hAnsi="Arial" w:cs="Arial"/>
+          <w:b/>
+          <w:bCs/>
+          <w:color w:val="141414"/>
+          <w:kern w:val="0"/>
+          <w:sz w:val="32"/>
+          <w:szCs w:val="32"/>
+          <w14:ligatures w14:val="none"/>
+        </w:rPr>
+      </w:pPr>
+      <w:r>
+        <w:rPr>
+          <w:rFonts w:ascii="Arial" w:eastAsia="Times New Roman" w:hAnsi="Arial" w:cs="Arial"/>
+          <w:b/>
+          <w:bCs/>
+          <w:color w:val="141414"/>
+          <w:kern w:val="0"/>
+          <w:sz w:val="32"/>
+          <w:szCs w:val="32"/>
+          <w14:ligatures w14:val="none"/>
+        </w:rPr>
+        <w:t>What I’d build (concrete)</w:t>
+      </w:r>
+    </w:p>
+    <w:p>
+      <w:pPr>
+        <w:shd w:val="clear" w:color="auto" w:fill="FCFCFC"/>
+        <w:spacing w:before="120" w:after="120" w:line="240" w:lineRule="auto"/>
+        <w:rPr>
+          <w:rFonts w:ascii="Arial" w:eastAsia="Times New Roman" w:hAnsi="Arial" w:cs="Arial"/>
+          <w:color w:val="141414"/>
+          <w:kern w:val="0"/>
+          <w:sz w:val="20"/>
+          <w:szCs w:val="20"/>
+          <w14:ligatures w14:val="none"/>
+        </w:rPr>
+      </w:pPr>
+      <w:r>
+        <w:rPr>
+          <w:rFonts w:ascii="Arial" w:eastAsia="Times New Roman" w:hAnsi="Arial" w:cs="Arial"/>
+          <w:b/>
+          <w:bCs/>
+          <w:color w:val="141414"/>
+          <w:kern w:val="0"/>
+          <w:sz w:val="20"/>
+          <w:szCs w:val="20"/>
+          <w14:ligatures w14:val="none"/>
+        </w:rPr>
+        <w:lastRenderedPageBreak/>
+        <w:t>Model A (full):</w:t>
+      </w:r>
+      <w:r>
+        <w:rPr>
+          <w:rFonts w:ascii="Arial" w:eastAsia="Times New Roman" w:hAnsi="Arial" w:cs="Arial"/>
+          <w:color w:val="141414"/>
+          <w:kern w:val="0"/>
+          <w:sz w:val="20"/>
+          <w:szCs w:val="20"/>
+          <w14:ligatures w14:val="none"/>
+        </w:rPr>
+        <w:br/>
+      </w:r>
+      <w:r>
+        <w:rPr>
+          <w:rFonts w:ascii="Menlo" w:eastAsia="Times New Roman" w:hAnsi="Menlo" w:cs="Menlo"/>
+          <w:color w:val="141414"/>
+          <w:kern w:val="0"/>
+          <w:sz w:val="18"/>
+          <w:szCs w:val="18"/>
+          <w14:ligatures w14:val="none"/>
+        </w:rPr>
+        <w:t>Y_draft ~ ability + poolq_loo + poolq_loo²</w:t>
+      </w:r>
+      <w:r>
+        <w:rPr>
+          <w:rFonts w:ascii="Arial" w:eastAsia="Times New Roman" w:hAnsi="Arial" w:cs="Arial"/>
+          <w:color w:val="141414"/>
+          <w:kern w:val="0"/>
+          <w:sz w:val="20"/>
+          <w:szCs w:val="20"/>
+          <w14:ligatures w14:val="none"/>
+        </w:rPr>
+        <w:br/>
+        <w:t>(or explicit selection-score form if you prefer theory-first)</w:t>
+      </w:r>
+    </w:p>
+    <w:p>
+      <w:pPr>
+        <w:shd w:val="clear" w:color="auto" w:fill="FCFCFC"/>
+        <w:spacing w:before="120" w:after="120" w:line="240" w:lineRule="auto"/>
+        <w:rPr>
+          <w:rFonts w:ascii="Arial" w:eastAsia="Times New Roman" w:hAnsi="Arial" w:cs="Arial"/>
+          <w:color w:val="141414"/>
+          <w:kern w:val="0"/>
+          <w:sz w:val="20"/>
+          <w:szCs w:val="20"/>
+          <w14:ligatures w14:val="none"/>
+        </w:rPr>
+      </w:pPr>
+      <w:r>
+        <w:rPr>
+          <w:rFonts w:ascii="Arial" w:eastAsia="Times New Roman" w:hAnsi="Arial" w:cs="Arial"/>
+          <w:b/>
+          <w:bCs/>
+          <w:color w:val="141414"/>
+          <w:kern w:val="0"/>
+          <w:sz w:val="20"/>
+          <w:szCs w:val="20"/>
+          <w14:ligatures w14:val="none"/>
+        </w:rPr>
+        <w:t>Model B (Alex counterfactual):</w:t>
+      </w:r>
+      <w:r>
+        <w:rPr>
+          <w:rFonts w:ascii="Arial" w:eastAsia="Times New Roman" w:hAnsi="Arial" w:cs="Arial"/>
+          <w:color w:val="141414"/>
+          <w:kern w:val="0"/>
+          <w:sz w:val="20"/>
+          <w:szCs w:val="20"/>
+          <w14:ligatures w14:val="none"/>
+        </w:rPr>
+        <w:br/>
+      </w:r>
+      <w:r>
+        <w:rPr>
+          <w:rFonts w:ascii="Menlo" w:eastAsia="Times New Roman" w:hAnsi="Menlo" w:cs="Menlo"/>
+          <w:color w:val="141414"/>
+          <w:kern w:val="0"/>
+          <w:sz w:val="18"/>
+          <w:szCs w:val="18"/>
+          <w14:ligatures w14:val="none"/>
+        </w:rPr>
+        <w:t>Y_draft ~ ability</w:t>
+      </w:r>
+      <w:r>
+        <w:rPr>
+          <w:rFonts w:ascii="Arial" w:eastAsia="Times New Roman" w:hAnsi="Arial" w:cs="Arial"/>
+          <w:color w:val="141414"/>
+          <w:kern w:val="0"/>
+          <w:sz w:val="20"/>
+          <w:szCs w:val="20"/>
+          <w14:ligatures w14:val="none"/>
+        </w:rPr>
+        <w:br/>
+        <w:t>(same ability measure: ppm z within season, BPM, etc.)</w:t>
+      </w:r>
+    </w:p>
+    <w:p>
+      <w:pPr>
+        <w:shd w:val="clear" w:color="auto" w:fill="FCFCFC"/>
+        <w:spacing w:before="120" w:after="120" w:line="240" w:lineRule="auto"/>
+        <w:rPr>
+          <w:rFonts w:ascii="Arial" w:eastAsia="Times New Roman" w:hAnsi="Arial" w:cs="Arial"/>
+          <w:color w:val="141414"/>
+          <w:kern w:val="0"/>
+          <w:sz w:val="20"/>
+          <w:szCs w:val="20"/>
+          <w14:ligatures w14:val="none"/>
+        </w:rPr>
+      </w:pPr>
+      <w:r>
+        <w:rPr>
+          <w:rFonts w:ascii="Arial" w:eastAsia="Times New Roman" w:hAnsi="Arial" w:cs="Arial"/>
+          <w:b/>
+          <w:bCs/>
+          <w:color w:val="141414"/>
+          <w:kern w:val="0"/>
+          <w:sz w:val="20"/>
+          <w:szCs w:val="20"/>
+          <w14:ligatures w14:val="none"/>
+        </w:rPr>
+        <w:t>Then report:</w:t>
+      </w:r>
+    </w:p>
+    <w:p>
+      <w:pPr>
+        <w:numPr>
+          <w:ilvl w:val="0"/>
+          <w:numId w:val="8"/>
+        </w:numPr>
+        <w:shd w:val="clear" w:color="auto" w:fill="FCFCFC"/>
+        <w:spacing w:before="100" w:beforeAutospacing="1" w:after="100" w:afterAutospacing="1" w:line="240" w:lineRule="auto"/>
+        <w:rPr>
+          <w:rFonts w:ascii="Arial" w:eastAsia="Times New Roman" w:hAnsi="Arial" w:cs="Arial"/>
+          <w:color w:val="141414"/>
+          <w:kern w:val="0"/>
+          <w:sz w:val="20"/>
+          <w:szCs w:val="20"/>
+          <w14:ligatures w14:val="none"/>
+        </w:rPr>
+      </w:pPr>
+      <w:r>
+        <w:rPr>
+          <w:rFonts w:ascii="Arial" w:eastAsia="Times New Roman" w:hAnsi="Arial" w:cs="Arial"/>
+          <w:b/>
+          <w:bCs/>
+          <w:color w:val="141414"/>
+          <w:kern w:val="0"/>
+          <w:sz w:val="20"/>
+          <w:szCs w:val="20"/>
+          <w14:ligatures w14:val="none"/>
+        </w:rPr>
+        <w:t>Overall prediction gain:</w:t>
+      </w:r>
+      <w:r>
+        <w:rPr>
+          <w:rFonts w:ascii="Arial" w:eastAsia="Times New Roman" w:hAnsi="Arial" w:cs="Arial"/>
+          <w:color w:val="141414"/>
+          <w:kern w:val="0"/>
+          <w:sz w:val="20"/>
+          <w:szCs w:val="20"/>
+          <w14:ligatures w14:val="none"/>
+        </w:rPr>
+        <w:t> ΔAUC, ΔBrier, or “X% relative improvement in log-loss” — Model A vs B.</w:t>
+      </w:r>
+    </w:p>
+    <w:p>
+      <w:pPr>
+        <w:numPr>
+          <w:ilvl w:val="0"/>
+          <w:numId w:val="8"/>
+        </w:numPr>
+        <w:shd w:val="clear" w:color="auto" w:fill="FCFCFC"/>
+        <w:spacing w:before="100" w:beforeAutospacing="1" w:after="100" w:afterAutospacing="1" w:line="240" w:lineRule="auto"/>
+        <w:rPr>
+          <w:rFonts w:ascii="Arial" w:eastAsia="Times New Roman" w:hAnsi="Arial" w:cs="Arial"/>
+          <w:color w:val="141414"/>
+          <w:kern w:val="0"/>
+          <w:sz w:val="20"/>
+          <w:szCs w:val="20"/>
+          <w14:ligatures w14:val="none"/>
+        </w:rPr>
+      </w:pPr>
+      <w:r>
+        <w:rPr>
+          <w:rFonts w:ascii="Arial" w:eastAsia="Times New Roman" w:hAnsi="Arial" w:cs="Arial"/>
+          <w:b/>
+          <w:bCs/>
+          <w:color w:val="141414"/>
+          <w:kern w:val="0"/>
+          <w:sz w:val="20"/>
+          <w:szCs w:val="20"/>
+          <w14:ligatures w14:val="none"/>
+        </w:rPr>
+        <w:t>Per-person counterfactual gap:</w:t>
+      </w:r>
+      <w:r>
+        <w:rPr>
+          <w:rFonts w:ascii="Arial" w:eastAsia="Times New Roman" w:hAnsi="Arial" w:cs="Arial"/>
+          <w:color w:val="141414"/>
+          <w:kern w:val="0"/>
+          <w:sz w:val="20"/>
+          <w:szCs w:val="20"/>
+          <w14:ligatures w14:val="none"/>
+        </w:rPr>
+        <w:t> </w:t>
+      </w:r>
+      <m:oMath>
+        <m:sSubSup>
+          <m:sSubSupPr>
+            <m:ctrlPr>
+              <w:rPr>
+                <w:rFonts w:ascii="Cambria Math" w:eastAsia="Times New Roman" w:hAnsi="Cambria Math" w:cs="Times New Roman"/>
+                <w:kern w:val="0"/>
+                <w14:ligatures w14:val="none"/>
+              </w:rPr>
+            </m:ctrlPr>
+          </m:sSubSupPr>
+          <m:e>
+            <m:acc>
+              <m:accPr>
+                <m:ctrlPr>
+                  <w:rPr>
+                    <w:rFonts w:ascii="Cambria Math" w:eastAsia="Times New Roman" w:hAnsi="Cambria Math" w:cs="Times New Roman"/>
+                    <w:kern w:val="0"/>
+                    <w14:ligatures w14:val="none"/>
+                  </w:rPr>
+                </m:ctrlPr>
+              </m:accPr>
+              <m:e>
+                <m:r>
+                  <w:rPr>
+                    <w:rFonts w:ascii="Cambria Math" w:eastAsia="Times New Roman" w:hAnsi="Cambria Math" w:cs="Times New Roman"/>
+                    <w:kern w:val="0"/>
+                    <w14:ligatures w14:val="none"/>
+                  </w:rPr>
+                  <m:t>p</m:t>
+                </m:r>
+              </m:e>
+            </m:acc>
+          </m:e>
+          <m:sub>
+            <m:r>
+              <w:rPr>
+                <w:rFonts w:ascii="Cambria Math" w:eastAsia="Times New Roman" w:hAnsi="Cambria Math" w:cs="Times New Roman"/>
+                <w:kern w:val="0"/>
+                <w14:ligatures w14:val="none"/>
+              </w:rPr>
+              <m:t>i</m:t>
+            </m:r>
+          </m:sub>
+          <m:sup>
+            <m:r>
+              <m:rPr>
+                <m:nor/>
+              </m:rPr>
+              <w:rPr>
+                <w:rFonts w:ascii="Times New Roman" w:eastAsia="Times New Roman" w:hAnsi="Times New Roman" w:cs="Times New Roman"/>
+                <w:kern w:val="0"/>
+                <w14:ligatures w14:val="none"/>
+              </w:rPr>
+              <m:t>full</m:t>
+            </m:r>
+          </m:sup>
+        </m:sSubSup>
+        <m:r>
+          <w:rPr>
+            <w:rFonts w:ascii="Cambria Math" w:eastAsia="Times New Roman" w:hAnsi="Cambria Math" w:cs="Times New Roman"/>
+            <w:kern w:val="0"/>
+            <w14:ligatures w14:val="none"/>
+          </w:rPr>
+          <m:t>-</m:t>
+        </m:r>
+        <m:sSubSup>
+          <m:sSubSupPr>
+            <m:ctrlPr>
+              <w:rPr>
+                <w:rFonts w:ascii="Cambria Math" w:eastAsia="Times New Roman" w:hAnsi="Cambria Math" w:cs="Times New Roman"/>
+                <w:kern w:val="0"/>
+                <w14:ligatures w14:val="none"/>
+              </w:rPr>
+            </m:ctrlPr>
+          </m:sSubSupPr>
+          <m:e>
+            <m:acc>
+              <m:accPr>
+                <m:ctrlPr>
+                  <w:rPr>
+                    <w:rFonts w:ascii="Cambria Math" w:eastAsia="Times New Roman" w:hAnsi="Cambria Math" w:cs="Times New Roman"/>
+                    <w:kern w:val="0"/>
+                    <w14:ligatures w14:val="none"/>
+                  </w:rPr>
+                </m:ctrlPr>
+              </m:accPr>
+              <m:e>
+                <m:r>
+                  <w:rPr>
+                    <w:rFonts w:ascii="Cambria Math" w:eastAsia="Times New Roman" w:hAnsi="Cambria Math" w:cs="Times New Roman"/>
+                    <w:kern w:val="0"/>
+                    <w14:ligatures w14:val="none"/>
+                  </w:rPr>
+                  <m:t>p</m:t>
+                </m:r>
+              </m:e>
+            </m:acc>
+          </m:e>
+          <m:sub>
+            <m:r>
+              <w:rPr>
+                <w:rFonts w:ascii="Cambria Math" w:eastAsia="Times New Roman" w:hAnsi="Cambria Math" w:cs="Times New Roman"/>
+                <w:kern w:val="0"/>
+                <w14:ligatures w14:val="none"/>
+              </w:rPr>
+              <m:t>i</m:t>
+            </m:r>
+          </m:sub>
+          <m:sup>
+            <m:r>
+              <m:rPr>
+                <m:nor/>
+              </m:rPr>
+              <w:rPr>
+                <w:rFonts w:ascii="Times New Roman" w:eastAsia="Times New Roman" w:hAnsi="Times New Roman" w:cs="Times New Roman"/>
+                <w:kern w:val="0"/>
+                <w14:ligatures w14:val="none"/>
+              </w:rPr>
+              <m:t>ability</m:t>
+            </m:r>
+          </m:sup>
+        </m:sSubSup>
+      </m:oMath>
+      <w:r>
+        <w:rPr>
+          <w:rFonts w:ascii="Arial" w:eastAsia="Times New Roman" w:hAnsi="Arial" w:cs="Arial"/>
+          <w:color w:val="141414"/>
+          <w:kern w:val="0"/>
+          <w:sz w:val="20"/>
+          <w:szCs w:val="20"/>
+          <w14:ligatures w14:val="none"/>
+        </w:rPr>
+        <w:t> — distribution, by ability ventile.</w:t>
+      </w:r>
+    </w:p>
+    <w:p>
+      <w:pPr>
+        <w:numPr>
+          <w:ilvl w:val="0"/>
+          <w:numId w:val="8"/>
+        </w:numPr>
+        <w:shd w:val="clear" w:color="auto" w:fill="FCFCFC"/>
+        <w:spacing w:before="100" w:beforeAutospacing="1" w:after="100" w:afterAutospacing="1" w:line="240" w:lineRule="auto"/>
+        <w:rPr>
+          <w:rFonts w:ascii="Arial" w:eastAsia="Times New Roman" w:hAnsi="Arial" w:cs="Arial"/>
+          <w:color w:val="141414"/>
+          <w:kern w:val="0"/>
+          <w:sz w:val="20"/>
+          <w:szCs w:val="20"/>
+          <w14:ligatures w14:val="none"/>
+        </w:rPr>
+      </w:pPr>
+      <w:r>
+        <w:rPr>
+          <w:rFonts w:ascii="Arial" w:eastAsia="Times New Roman" w:hAnsi="Arial" w:cs="Arial"/>
+          <w:b/>
+          <w:bCs/>
+          <w:color w:val="141414"/>
+          <w:kern w:val="0"/>
+          <w:sz w:val="20"/>
+          <w:szCs w:val="20"/>
+          <w14:ligatures w14:val="none"/>
+        </w:rPr>
+        <w:t>Ability-stratified error:</w:t>
+      </w:r>
+      <w:r>
+        <w:rPr>
+          <w:rFonts w:ascii="Arial" w:eastAsia="Times New Roman" w:hAnsi="Arial" w:cs="Arial"/>
+          <w:color w:val="141414"/>
+          <w:kern w:val="0"/>
+          <w:sz w:val="20"/>
+          <w:szCs w:val="20"/>
+          <w14:ligatures w14:val="none"/>
+        </w:rPr>
+        <w:t> Alex’s hypothesis — </w:t>
+      </w:r>
+      <w:r>
+        <w:rPr>
+          <w:rFonts w:ascii="Arial" w:eastAsia="Times New Roman" w:hAnsi="Arial" w:cs="Arial"/>
+          <w:b/>
+          <w:bCs/>
+          <w:color w:val="141414"/>
+          <w:kern w:val="0"/>
+          <w:sz w:val="20"/>
+          <w:szCs w:val="20"/>
+          <w14:ligatures w14:val="none"/>
+        </w:rPr>
+        <w:t>largest gaps at the top</w:t>
+      </w:r>
+      <w:r>
+        <w:rPr>
+          <w:rFonts w:ascii="Arial" w:eastAsia="Times New Roman" w:hAnsi="Arial" w:cs="Arial"/>
+          <w:color w:val="141414"/>
+          <w:kern w:val="0"/>
+          <w:sz w:val="20"/>
+          <w:szCs w:val="20"/>
+          <w14:ligatures w14:val="none"/>
+        </w:rPr>
+        <w:t> of the ability distribution (where elite </w:t>
+      </w:r>
+      <m:oMath>
+        <m:sSub>
+          <m:sSubPr>
+            <m:ctrlPr>
+              <w:rPr>
+                <w:rFonts w:ascii="Cambria Math" w:eastAsia="Times New Roman" w:hAnsi="Cambria Math" w:cs="Times New Roman"/>
+                <w:kern w:val="0"/>
+                <w14:ligatures w14:val="none"/>
+              </w:rPr>
+            </m:ctrlPr>
+          </m:sSubPr>
+          <m:e>
+            <m:r>
+              <w:rPr>
+                <w:rFonts w:ascii="Cambria Math" w:eastAsia="Times New Roman" w:hAnsi="Cambria Math" w:cs="Times New Roman"/>
+                <w:kern w:val="0"/>
+                <w14:ligatures w14:val="none"/>
+              </w:rPr>
+              <m:t>L</m:t>
+            </m:r>
+          </m:e>
+          <m:sub>
+            <m:r>
+              <w:rPr>
+                <w:rFonts w:ascii="Cambria Math" w:eastAsia="Times New Roman" w:hAnsi="Cambria Math" w:cs="Times New Roman"/>
+                <w:kern w:val="0"/>
+                <w14:ligatures w14:val="none"/>
+              </w:rPr>
+              <m:t>Q</m:t>
+            </m:r>
+          </m:sub>
+        </m:sSub>
+      </m:oMath>
+      <w:r>
+        <w:rPr>
+          <w:rFonts w:ascii="Arial" w:eastAsia="Times New Roman" w:hAnsi="Arial" w:cs="Arial"/>
+          <w:color w:val="141414"/>
+          <w:kern w:val="0"/>
+          <w:sz w:val="20"/>
+          <w:szCs w:val="20"/>
+          <w14:ligatures w14:val="none"/>
+        </w:rPr>
+        <w:t> congestion bites).</w:t>
+      </w:r>
+    </w:p>
+    <w:p>
+      <w:pPr>
+        <w:numPr>
+          <w:ilvl w:val="0"/>
+          <w:numId w:val="8"/>
+        </w:numPr>
+        <w:shd w:val="clear" w:color="auto" w:fill="FCFCFC"/>
+        <w:spacing w:before="100" w:beforeAutospacing="1" w:after="100" w:afterAutospacing="1" w:line="240" w:lineRule="auto"/>
+        <w:rPr>
+          <w:rFonts w:ascii="Arial" w:eastAsia="Times New Roman" w:hAnsi="Arial" w:cs="Arial"/>
+          <w:color w:val="141414"/>
+          <w:kern w:val="0"/>
+          <w:sz w:val="20"/>
+          <w:szCs w:val="20"/>
+          <w14:ligatures w14:val="none"/>
+        </w:rPr>
+      </w:pPr>
+      <w:r>
+        <w:rPr>
+          <w:rFonts w:ascii="Arial" w:eastAsia="Times New Roman" w:hAnsi="Arial" w:cs="Arial"/>
+          <w:b/>
+          <w:bCs/>
+          <w:color w:val="141414"/>
+          <w:kern w:val="0"/>
+          <w:sz w:val="20"/>
+          <w:szCs w:val="20"/>
+          <w14:ligatures w14:val="none"/>
+        </w:rPr>
+        <w:t>Slot scarcity sensitivity:</w:t>
+      </w:r>
+      <w:r>
+        <w:rPr>
+          <w:rFonts w:ascii="Arial" w:eastAsia="Times New Roman" w:hAnsi="Arial" w:cs="Arial"/>
+          <w:color w:val="141414"/>
+          <w:kern w:val="0"/>
+          <w:sz w:val="20"/>
+          <w:szCs w:val="20"/>
+          <w14:ligatures w14:val="none"/>
+        </w:rPr>
+        <w:t> stratify or note NBA draft ~60 picks vs Army promotion rates — “under what K is this a rounding error vs a driver?”</w:t>
+      </w:r>
+    </w:p>
+    <w:p>
+      <w:pPr>
+        <w:shd w:val="clear" w:color="auto" w:fill="FCFCFC"/>
+        <w:spacing w:before="120" w:after="120" w:line="240" w:lineRule="auto"/>
+        <w:rPr>
+          <w:rFonts w:ascii="Arial" w:eastAsia="Times New Roman" w:hAnsi="Arial" w:cs="Arial"/>
+          <w:color w:val="141414"/>
+          <w:kern w:val="0"/>
+          <w:sz w:val="20"/>
+          <w:szCs w:val="20"/>
+          <w14:ligatures w14:val="none"/>
+        </w:rPr>
+      </w:pPr>
+      <w:r>
+        <w:rPr>
+          <w:rFonts w:ascii="Arial" w:eastAsia="Times New Roman" w:hAnsi="Arial" w:cs="Arial"/>
+          <w:b/>
+          <w:bCs/>
+          <w:color w:val="141414"/>
+          <w:kern w:val="0"/>
+          <w:sz w:val="20"/>
+          <w:szCs w:val="20"/>
+          <w14:ligatures w14:val="none"/>
+        </w:rPr>
+        <w:t>Important caveat Alex acknowledged:</w:t>
+      </w:r>
+      <w:r>
+        <w:rPr>
+          <w:rFonts w:ascii="Arial" w:eastAsia="Times New Roman" w:hAnsi="Arial" w:cs="Arial"/>
+          <w:color w:val="141414"/>
+          <w:kern w:val="0"/>
+          <w:sz w:val="20"/>
+          <w:szCs w:val="20"/>
+          <w14:ligatures w14:val="none"/>
+        </w:rPr>
+        <w:t> ppm/ability is </w:t>
+      </w:r>
+      <w:r>
+        <w:rPr>
+          <w:rFonts w:ascii="Arial" w:eastAsia="Times New Roman" w:hAnsi="Arial" w:cs="Arial"/>
+          <w:b/>
+          <w:bCs/>
+          <w:color w:val="141414"/>
+          <w:kern w:val="0"/>
+          <w:sz w:val="20"/>
+          <w:szCs w:val="20"/>
+          <w14:ligatures w14:val="none"/>
+        </w:rPr>
+        <w:t>partly endogenous</w:t>
+      </w:r>
+      <w:r>
+        <w:rPr>
+          <w:rFonts w:ascii="Arial" w:eastAsia="Times New Roman" w:hAnsi="Arial" w:cs="Arial"/>
+          <w:color w:val="141414"/>
+          <w:kern w:val="0"/>
+          <w:sz w:val="20"/>
+          <w:szCs w:val="20"/>
+          <w14:ligatures w14:val="none"/>
+        </w:rPr>
+        <w:t> to roster context. He’s OK with a </w:t>
+      </w:r>
+      <w:r>
+        <w:rPr>
+          <w:rFonts w:ascii="Arial" w:eastAsia="Times New Roman" w:hAnsi="Arial" w:cs="Arial"/>
+          <w:b/>
+          <w:bCs/>
+          <w:color w:val="141414"/>
+          <w:kern w:val="0"/>
+          <w:sz w:val="20"/>
+          <w:szCs w:val="20"/>
+          <w14:ligatures w14:val="none"/>
+        </w:rPr>
+        <w:t>fabricated assessment world</w:t>
+      </w:r>
+      <w:r>
+        <w:rPr>
+          <w:rFonts w:ascii="Arial" w:eastAsia="Times New Roman" w:hAnsi="Arial" w:cs="Arial"/>
+          <w:color w:val="141414"/>
+          <w:kern w:val="0"/>
+          <w:sz w:val="20"/>
+          <w:szCs w:val="20"/>
+          <w14:ligatures w14:val="none"/>
+        </w:rPr>
+        <w:t> for the counterfactual — articulate that clearly; don’t claim you rewound development.</w:t>
+      </w:r>
+    </w:p>
+    <w:p>
+      <w:pPr>
+        <w:spacing w:before="240" w:after="240" w:line="240" w:lineRule="auto"/>
+        <w:rPr>
+          <w:rFonts w:ascii="Arial" w:eastAsia="Times New Roman" w:hAnsi="Arial" w:cs="Arial"/>
+          <w:kern w:val="0"/>
+          <w:sz w:val="20"/>
+          <w:szCs w:val="20"/>
+          <w14:ligatures w14:val="none"/>
+        </w:rPr>
+      </w:pPr>
+      <w:r>
+        <w:rPr>
+          <w:noProof/>
+        </w:rPr>
+      </w:r>
+      <w:r>
+        <w:pict w14:anchorId="32EB9B4B">
+          <v:rect id="Horizontal Line 14" o:spid="_x0000_s1027" style="width:540pt;height:.1pt;visibility:visible;mso-wrap-style:square;mso-left-percent:-10001;mso-top-percent:-10001;mso-position-horizontal:absolute;mso-position-horizontal-relative:char;mso-position-vertical:absolute;mso-position-vertical-relative:line;mso-left-percent:-10001;mso-top-percent:-10001;v-text-anchor:top" o:gfxdata="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" filled="f">
+            <o:lock v:ext="edit" rotation="t" aspectratio="t" verticies="t" text="t" shapetype="t"/>
+            <w10:anchorlock/>
+          </v:rect>
+        </w:pict>
+      </w:r>
+    </w:p>
+    <w:p>
+      <w:pPr>
+        <w:shd w:val="clear" w:color="auto" w:fill="FCFCFC"/>
+        <w:spacing w:before="216" w:after="84" w:line="240" w:lineRule="auto"/>
+        <w:outlineLvl w:val="1"/>
+        <w:rPr>
+          <w:rFonts w:ascii="Arial" w:eastAsia="Times New Roman" w:hAnsi="Arial" w:cs="Arial"/>
+          <w:b/>
+          <w:bCs/>
+          <w:color w:val="141414"/>
+          <w:kern w:val="0"/>
+          <w:sz w:val="32"/>
+          <w:szCs w:val="32"/>
+          <w14:ligatures w14:val="none"/>
+        </w:rPr>
+      </w:pPr>
+      <w:r>
+        <w:rPr>
+          <w:rFonts w:ascii="Arial" w:eastAsia="Times New Roman" w:hAnsi="Arial" w:cs="Arial"/>
+          <w:b/>
+          <w:bCs/>
+          <w:color w:val="141414"/>
+          <w:kern w:val="0"/>
+          <w:sz w:val="32"/>
+          <w:szCs w:val="32"/>
+          <w14:ligatures w14:val="none"/>
+        </w:rPr>
+        <w:t>Charles’s “team player” idea</w:t>
+      </w:r>
+    </w:p>
+    <w:p>
+      <w:pPr>
+        <w:shd w:val="clear" w:color="auto" w:fill="FCFCFC"/>
+        <w:spacing w:before="120" w:after="120" w:line="240" w:lineRule="auto"/>
+        <w:rPr>
+          <w:rFonts w:ascii="Arial" w:eastAsia="Times New Roman" w:hAnsi="Arial" w:cs="Arial"/>
+          <w:color w:val="141414"/>
+          <w:kern w:val="0"/>
+          <w:sz w:val="20"/>
+          <w:szCs w:val="20"/>
+          <w14:ligatures w14:val="none"/>
+        </w:rPr>
+      </w:pPr>
+      <w:r>
+        <w:rPr>
+          <w:rFonts w:ascii="Arial" w:eastAsia="Times New Roman" w:hAnsi="Arial" w:cs="Arial"/>
+          <w:color w:val="141414"/>
+          <w:kern w:val="0"/>
+          <w:sz w:val="20"/>
+          <w:szCs w:val="20"/>
+          <w14:ligatures w14:val="none"/>
+        </w:rPr>
+        <w:t>Alex liked the intuition (some thrive in elite peer pools, some don’t) but said </w:t>
+      </w:r>
+      <w:r>
+        <w:rPr>
+          <w:rFonts w:ascii="Arial" w:eastAsia="Times New Roman" w:hAnsi="Arial" w:cs="Arial"/>
+          <w:b/>
+          <w:bCs/>
+          <w:color w:val="141414"/>
+          <w:kern w:val="0"/>
+          <w:sz w:val="20"/>
+          <w:szCs w:val="20"/>
+          <w14:ligatures w14:val="none"/>
+        </w:rPr>
+        <w:t>too many confounders</w:t>
+      </w:r>
+      <w:r>
+        <w:rPr>
+          <w:rFonts w:ascii="Arial" w:eastAsia="Times New Roman" w:hAnsi="Arial" w:cs="Arial"/>
+          <w:color w:val="141414"/>
+          <w:kern w:val="0"/>
+          <w:sz w:val="20"/>
+          <w:szCs w:val="20"/>
+          <w14:ligatures w14:val="none"/>
+        </w:rPr>
+        <w:t> for now. Park it — different from the roster-pressure-in-</w:t>
+      </w:r>
+      <w:r>
+        <w:rPr>
+          <w:rFonts w:ascii="Arial" w:eastAsia="Times New Roman" w:hAnsi="Arial" w:cs="Arial"/>
+          <w:b/>
+          <w:bCs/>
+          <w:color w:val="141414"/>
+          <w:kern w:val="0"/>
+          <w:sz w:val="20"/>
+          <w:szCs w:val="20"/>
+          <w14:ligatures w14:val="none"/>
+        </w:rPr>
+        <w:t>selection-score</w:t>
+      </w:r>
+      <w:r>
+        <w:rPr>
+          <w:rFonts w:ascii="Arial" w:eastAsia="Times New Roman" w:hAnsi="Arial" w:cs="Arial"/>
+          <w:color w:val="141414"/>
+          <w:kern w:val="0"/>
+          <w:sz w:val="20"/>
+          <w:szCs w:val="20"/>
+          <w14:ligatures w14:val="none"/>
+        </w:rPr>
+        <w:t> question.</w:t>
+      </w:r>
+    </w:p>
+    <w:p>
+      <w:pPr>
+        <w:spacing w:before="240" w:after="240" w:line="240" w:lineRule="auto"/>
+        <w:rPr>
+          <w:rFonts w:ascii="Arial" w:eastAsia="Times New Roman" w:hAnsi="Arial" w:cs="Arial"/>
+          <w:kern w:val="0"/>
+          <w:sz w:val="20"/>
+          <w:szCs w:val="20"/>
+          <w14:ligatures w14:val="none"/>
+        </w:rPr>
+      </w:pPr>
+      <w:r>
+        <w:rPr>
+          <w:noProof/>
+        </w:rPr>
+      </w:r>
+      <w:r>
+        <w:pict w14:anchorId="063AE288">
+          <v:rect id="Horizontal Line 15" o:spid="_x0000_s1026" style="width:540pt;height:.1pt;visibility:visible;mso-wrap-style:square;mso-left-percent:-10001;mso-top-percent:-10001;mso-position-horizontal:absolute;mso-position-horizontal-relative:char;mso-position-vertical:absolute;mso-position-vertical-relative:line;mso-left-percent:-10001;mso-top-percent:-10001;v-text-anchor:top" o:gfxdata="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" filled="f">
+            <o:lock v:ext="edit" rotation="t" aspectratio="t" verticies="t" text="t" shapetype="t"/>
+            <w10:anchorlock/>
+          </v:rect>
+        </w:pict>
+      </w:r>
+    </w:p>
+    <w:p>
+      <w:pPr>
+        <w:shd w:val="clear" w:color="auto" w:fill="FCFCFC"/>
+        <w:spacing w:before="216" w:after="84" w:line="240" w:lineRule="auto"/>
+        <w:outlineLvl w:val="1"/>
+        <w:rPr>
+          <w:rFonts w:ascii="Arial" w:eastAsia="Times New Roman" w:hAnsi="Arial" w:cs="Arial"/>
+          <w:b/>
+          <w:bCs/>
+          <w:color w:val="141414"/>
+          <w:kern w:val="0"/>
+          <w:sz w:val="32"/>
+          <w:szCs w:val="32"/>
+          <w14:ligatures w14:val="none"/>
+        </w:rPr>
+      </w:pPr>
+      <w:r>
+        <w:rPr>
+          <w:rFonts w:ascii="Arial" w:eastAsia="Times New Roman" w:hAnsi="Arial" w:cs="Arial"/>
+          <w:b/>
+          <w:bCs/>
+          <w:color w:val="141414"/>
+          <w:kern w:val="0"/>
+          <w:sz w:val="32"/>
+          <w:szCs w:val="32"/>
+          <w14:ligatures w14:val="none"/>
+        </w:rPr>
+        <w:t>Bottom line</w:t>
+      </w:r>
+    </w:p>
+    <w:p>
+      <w:pPr>
+        <w:shd w:val="clear" w:color="auto" w:fill="FCFCFC"/>
+        <w:spacing w:before="120" w:after="120" w:line="240" w:lineRule="auto"/>
+        <w:rPr>
+          <w:rFonts w:ascii="Arial" w:eastAsia="Times New Roman" w:hAnsi="Arial" w:cs="Arial"/>
+          <w:color w:val="141414"/>
+          <w:kern w:val="0"/>
+          <w:sz w:val="20"/>
+          <w:szCs w:val="20"/>
+          <w14:ligatures w14:val="none"/>
+        </w:rPr>
+      </w:pPr>
+      <w:r>
+        <w:rPr>
+          <w:rFonts w:ascii="Arial" w:eastAsia="Times New Roman" w:hAnsi="Arial" w:cs="Arial"/>
+          <w:color w:val="141414"/>
+          <w:kern w:val="0"/>
+          <w:sz w:val="20"/>
+          <w:szCs w:val="20"/>
+          <w14:ligatures w14:val="none"/>
+        </w:rPr>
+        <w:t>The transcript </w:t>
+      </w:r>
+      <w:r>
+        <w:rPr>
+          <w:rFonts w:ascii="Arial" w:eastAsia="Times New Roman" w:hAnsi="Arial" w:cs="Arial"/>
+          <w:b/>
+          <w:bCs/>
+          <w:color w:val="141414"/>
+          <w:kern w:val="0"/>
+          <w:sz w:val="20"/>
+          <w:szCs w:val="20"/>
+          <w14:ligatures w14:val="none"/>
+        </w:rPr>
+        <w:t>sharpens #3</w:t>
+      </w:r>
+      <w:r>
+        <w:rPr>
+          <w:rFonts w:ascii="Arial" w:eastAsia="Times New Roman" w:hAnsi="Arial" w:cs="Arial"/>
+          <w:color w:val="141414"/>
+          <w:kern w:val="0"/>
+          <w:sz w:val="20"/>
+          <w:szCs w:val="20"/>
+          <w14:ligatures w14:val="none"/>
+        </w:rPr>
+        <w:t> considerably:</w:t>
+      </w:r>
+    </w:p>
+    <w:p>
+      <w:pPr>
+        <w:numPr>
+          <w:ilvl w:val="0"/>
+          <w:numId w:val="9"/>
+        </w:numPr>
+        <w:shd w:val="clear" w:color="auto" w:fill="FCFCFC"/>
+        <w:spacing w:before="100" w:beforeAutospacing="1" w:after="100" w:afterAutospacing="1" w:line="240" w:lineRule="auto"/>
+        <w:rPr>
+          <w:rFonts w:ascii="Arial" w:eastAsia="Times New Roman" w:hAnsi="Arial" w:cs="Arial"/>
+          <w:color w:val="141414"/>
+          <w:kern w:val="0"/>
+          <w:sz w:val="20"/>
+          <w:szCs w:val="20"/>
+          <w14:ligatures w14:val="none"/>
+        </w:rPr>
+      </w:pPr>
+      <w:r>
+        <w:rPr>
+          <w:rFonts w:ascii="Arial" w:eastAsia="Times New Roman" w:hAnsi="Arial" w:cs="Arial"/>
+          <w:b/>
+          <w:bCs/>
+          <w:color w:val="141414"/>
+          <w:kern w:val="0"/>
+          <w:sz w:val="20"/>
+          <w:szCs w:val="20"/>
+          <w14:ligatures w14:val="none"/>
+        </w:rPr>
+        <w:t>Not:</w:t>
+      </w:r>
+      <w:r>
+        <w:rPr>
+          <w:rFonts w:ascii="Arial" w:eastAsia="Times New Roman" w:hAnsi="Arial" w:cs="Arial"/>
+          <w:color w:val="141414"/>
+          <w:kern w:val="0"/>
+          <w:sz w:val="20"/>
+          <w:szCs w:val="20"/>
+          <w14:ligatures w14:val="none"/>
+        </w:rPr>
+        <w:t> overlay hero vs naive binned curves and call it done.</w:t>
+      </w:r>
+    </w:p>
+    <w:p>
+      <w:pPr>
+        <w:numPr>
+          <w:ilvl w:val="0"/>
+          <w:numId w:val="9"/>
+        </w:numPr>
+        <w:shd w:val="clear" w:color="auto" w:fill="FCFCFC"/>
+        <w:spacing w:before="100" w:beforeAutospacing="1" w:after="100" w:afterAutospacing="1" w:line="240" w:lineRule="auto"/>
+        <w:rPr>
+          <w:rFonts w:ascii="Arial" w:eastAsia="Times New Roman" w:hAnsi="Arial" w:cs="Arial"/>
+          <w:color w:val="141414"/>
+          <w:kern w:val="0"/>
+          <w:sz w:val="20"/>
+          <w:szCs w:val="20"/>
+          <w14:ligatures w14:val="none"/>
+        </w:rPr>
+      </w:pPr>
+      <w:r>
+        <w:rPr>
+          <w:rFonts w:ascii="Arial" w:eastAsia="Times New Roman" w:hAnsi="Arial" w:cs="Arial"/>
+          <w:b/>
+          <w:bCs/>
+          <w:color w:val="141414"/>
+          <w:kern w:val="0"/>
+          <w:sz w:val="20"/>
+          <w:szCs w:val="20"/>
+          <w14:ligatures w14:val="none"/>
+        </w:rPr>
+        <w:t>Yes:</w:t>
+      </w:r>
+      <w:r>
+        <w:rPr>
+          <w:rFonts w:ascii="Arial" w:eastAsia="Times New Roman" w:hAnsi="Arial" w:cs="Arial"/>
+          <w:color w:val="141414"/>
+          <w:kern w:val="0"/>
+          <w:sz w:val="20"/>
+          <w:szCs w:val="20"/>
+          <w14:ligatures w14:val="none"/>
+        </w:rPr>
+        <w:t> fit two predictive models (roster-in-score on vs off), compare </w:t>
+      </w:r>
+      <w:r>
+        <w:rPr>
+          <w:rFonts w:ascii="Arial" w:eastAsia="Times New Roman" w:hAnsi="Arial" w:cs="Arial"/>
+          <w:b/>
+          <w:bCs/>
+          <w:color w:val="141414"/>
+          <w:kern w:val="0"/>
+          <w:sz w:val="20"/>
+          <w:szCs w:val="20"/>
+          <w14:ligatures w14:val="none"/>
+        </w:rPr>
+        <w:t>individual predicted promotion/draft probabilities</w:t>
+      </w:r>
+      <w:r>
+        <w:rPr>
+          <w:rFonts w:ascii="Arial" w:eastAsia="Times New Roman" w:hAnsi="Arial" w:cs="Arial"/>
+          <w:color w:val="141414"/>
+          <w:kern w:val="0"/>
+          <w:sz w:val="20"/>
+          <w:szCs w:val="20"/>
+          <w14:ligatures w14:val="none"/>
+        </w:rPr>
+        <w:t>, report </w:t>
+      </w:r>
+      <w:r>
+        <w:rPr>
+          <w:rFonts w:ascii="Arial" w:eastAsia="Times New Roman" w:hAnsi="Arial" w:cs="Arial"/>
+          <w:b/>
+          <w:bCs/>
+          <w:color w:val="141414"/>
+          <w:kern w:val="0"/>
+          <w:sz w:val="20"/>
+          <w:szCs w:val="20"/>
+          <w14:ligatures w14:val="none"/>
+        </w:rPr>
+        <w:t>overall predictive gain</w:t>
+      </w:r>
+      <w:r>
+        <w:rPr>
+          <w:rFonts w:ascii="Arial" w:eastAsia="Times New Roman" w:hAnsi="Arial" w:cs="Arial"/>
+          <w:color w:val="141414"/>
+          <w:kern w:val="0"/>
+          <w:sz w:val="20"/>
+          <w:szCs w:val="20"/>
+          <w14:ligatures w14:val="none"/>
+        </w:rPr>
+        <w:t> and </w:t>
+      </w:r>
+      <w:r>
+        <w:rPr>
+          <w:rFonts w:ascii="Arial" w:eastAsia="Times New Roman" w:hAnsi="Arial" w:cs="Arial"/>
+          <w:b/>
+          <w:bCs/>
+          <w:color w:val="141414"/>
+          <w:kern w:val="0"/>
+          <w:sz w:val="20"/>
+          <w:szCs w:val="20"/>
+          <w14:ligatures w14:val="none"/>
+        </w:rPr>
+        <w:t>ability-dependent error</w:t>
+      </w:r>
+      <w:r>
+        <w:rPr>
+          <w:rFonts w:ascii="Arial" w:eastAsia="Times New Roman" w:hAnsi="Arial" w:cs="Arial"/>
+          <w:color w:val="141414"/>
+          <w:kern w:val="0"/>
+          <w:sz w:val="20"/>
+          <w:szCs w:val="20"/>
+          <w14:ligatures w14:val="none"/>
+        </w:rPr>
+        <w:t>, and tie magnitude to </w:t>
+      </w:r>
+      <w:r>
+        <w:rPr>
+          <w:rFonts w:ascii="Arial" w:eastAsia="Times New Roman" w:hAnsi="Arial" w:cs="Arial"/>
+          <w:b/>
+          <w:bCs/>
+          <w:color w:val="141414"/>
+          <w:kern w:val="0"/>
+          <w:sz w:val="20"/>
+          <w:szCs w:val="20"/>
+          <w14:ligatures w14:val="none"/>
+        </w:rPr>
+        <w:t>carrying capacity</w:t>
+      </w:r>
+      <w:r>
+        <w:rPr>
+          <w:rFonts w:ascii="Arial" w:eastAsia="Times New Roman" w:hAnsi="Arial" w:cs="Arial"/>
+          <w:color w:val="141414"/>
+          <w:kern w:val="0"/>
+          <w:sz w:val="20"/>
+          <w:szCs w:val="20"/>
+          <w14:ligatures w14:val="none"/>
+        </w:rPr>
+        <w:t> (draft slots, promotion caps).</w:t>
+      </w:r>
+    </w:p>
+    <w:p>
+      <w:pPr>
+        <w:shd w:val="clear" w:color="auto" w:fill="FCFCFC"/>
+        <w:spacing w:before="120" w:after="0" w:line="240" w:lineRule="auto"/>
+        <w:rPr>
+          <w:rFonts w:ascii="Arial" w:eastAsia="Times New Roman" w:hAnsi="Arial" w:cs="Arial"/>
+          <w:color w:val="141414"/>
+          <w:kern w:val="0"/>
+          <w:sz w:val="20"/>
+          <w:szCs w:val="20"/>
+          <w14:ligatures w14:val="none"/>
+        </w:rPr>
+      </w:pPr>
+      <w:r>
+        <w:rPr>
+          <w:rFonts w:ascii="Arial" w:eastAsia="Times New Roman" w:hAnsi="Arial" w:cs="Arial"/>
+          <w:color w:val="141414"/>
+          <w:kern w:val="0"/>
+          <w:sz w:val="20"/>
+          <w:szCs w:val="20"/>
+          <w14:ligatures w14:val="none"/>
+        </w:rPr>
+        <w:t>That’s deliverable on the 530 panel without new data — but it </w:t>
+      </w:r>
+      <w:r>
+        <w:rPr>
+          <w:rFonts w:ascii="Arial" w:eastAsia="Times New Roman" w:hAnsi="Arial" w:cs="Arial"/>
+          <w:b/>
+          <w:bCs/>
+          <w:color w:val="141414"/>
+          <w:kern w:val="0"/>
+          <w:sz w:val="20"/>
+          <w:szCs w:val="20"/>
+          <w14:ligatures w14:val="none"/>
+        </w:rPr>
+        <w:t>is</w:t>
+      </w:r>
+      <w:r>
+        <w:rPr>
+          <w:rFonts w:ascii="Arial" w:eastAsia="Times New Roman" w:hAnsi="Arial" w:cs="Arial"/>
+          <w:color w:val="141414"/>
+          <w:kern w:val="0"/>
+          <w:sz w:val="20"/>
+          <w:szCs w:val="20"/>
+          <w14:ligatures w14:val="none"/>
+        </w:rPr>
+        <w:t> new analysis beyond the hero PNG. Want me to add this Alex framing to Pertinent Thoughts #3 and/or draft a one-page “magnitude spec” for the checklist?</w:t>
+      </w:r>
+    </w:p>
     <w:p/>
     <w:sectPr>
       <w:pgSz w:w="12240" w:h="15840"/>
@@ -5012,6 +7823,123 @@
 <file path=word/numbering.xml><?xml version="1.0" encoding="utf-8"?>
 <w:numbering xmlns:wpc="http://schemas.microsoft.com/office/word/2010/wordprocessingCanvas" xmlns:cx="http://schemas.microsoft.com/office/drawing/2014/chartex" xmlns:cx1="http://schemas.microsoft.com/office/drawing/2015/9/8/chartex" xmlns:cx2="http://schemas.microsoft.com/office/drawing/2015/10/21/chartex" xmlns:cx3="http://schemas.microsoft.com/office/drawing/2016/5/9/chartex" xmlns:cx4="http://schemas.microsoft.com/office/drawing/2016/5/10/chartex" xmlns:cx5="http://schemas.microsoft.com/office/drawing/2016/5/11/chartex" xmlns:cx6="http://schemas.microsoft.com/office/drawing/2016/5/12/chartex" xmlns:cx7="http://schemas.microsoft.com/office/drawing/2016/5/13/chartex" xmlns:cx8="http://schemas.microsoft.com/office/drawing/2016/5/14/chartex" xmlns:mc="http://schemas.openxmlformats.org/markup-compatibility/2006" xmlns:m="http://schemas.openxmlformats.org/officeDocument/2006/math" xmlns:aink="http://schemas.microsoft.com/office/drawing/2016/ink" xmlns:am3d="http://schemas.microsoft.com/office/drawing/2017/model3d" xmlns:oel="http://schemas.microsoft.com/office/2019/extlst" xmlns:r="http://schemas.openxmlformats.org/officeDocument/2006/relationships" xmlns:wp14="http://schemas.microsoft.com/office/word/2010/wordprocessingDrawing" xmlns:wp="http://schemas.openxmlformats.org/drawingml/2006/wordprocessingDrawing" xmlns:wpg="http://schemas.microsoft.com/office/word/2010/wordprocessingGroup" xmlns:wpi="http://schemas.microsoft.com/office/word/2010/wordprocessingInk" xmlns:wps="http://schemas.microsoft.com/office/word/2010/wordprocessingShape" xmlns:o="urn:schemas-microsoft-com:office:office" xmlns:v="urn:schemas-microsoft-com:vml" xmlns:w10="urn:schemas-microsoft-com:office:word" xmlns:w="http://schemas.openxmlformats.org/wordprocessingml/2006/main" xmlns:w14="http://schemas.microsoft.com/office/word/2010/wordml" xmlns:w15="http://schemas.microsoft.com/office/word/2012/wordml" xmlns:w16cei="http://schemas.microsoft.com/office/word/2026/wordml/cei" xmlns:w16cex="http://schemas.microsoft.com/office/word/2018/wordml/cex" xmlns:w16cid="http://schemas.microsoft.com/office/word/2016/wordml/cid" xmlns:w16="http://schemas.microsoft.com/office/word/2018/wordml" xmlns:w16sdtdh="http://schemas.microsoft.com/office/word/2020/wordml/sdtdatahash" xmlns:w16sdtfl="http://schemas.microsoft.com/office/word/2024/wordml/sdtformatlock" xmlns:w16se="http://schemas.microsoft.com/office/word/2015/wordml/symex" xmlns:w16du="http://schemas.microsoft.com/office/word/2023/wordml/word16du" xmlns:wne="http://schemas.microsoft.com/office/word/2006/wordml" mc:Ignorable="w14 w15 w16se w16cid w16 w16cex w16sdtdh w16sdtfl w16du wp14">
   <w:abstractNum w:abstractNumId="0" w15:restartNumberingAfterBreak="0">
+    <w:nsid w:val="02F75C13"/>
+    <w:multiLevelType w:val="multilevel"/>
+    <w:tmpl w:val="06A2C850"/>
+    <w:lvl w:ilvl="0">
+      <w:start w:val="1"/>
+      <w:numFmt w:val="decimal"/>
+      <w:lvlText w:val="%1."/>
+      <w:lvlJc w:val="left"/>
+      <w:pPr>
+        <w:tabs>
+          <w:tab w:val="num" w:pos="720"/>
+        </w:tabs>
+        <w:ind w:left="720" w:hanging="360"/>
+      </w:pPr>
+    </w:lvl>
+    <w:lvl w:ilvl="1">
+      <w:start w:val="1"/>
+      <w:numFmt w:val="bullet"/>
+      <w:lvlText w:val="o"/>
+      <w:lvlJc w:val="left"/>
+      <w:pPr>
+        <w:tabs>
+          <w:tab w:val="num" w:pos="1440"/>
+        </w:tabs>
+        <w:ind w:left="1440" w:hanging="360"/>
+      </w:pPr>
+      <w:rPr>
+        <w:rFonts w:ascii="Courier New" w:hAnsi="Courier New" w:hint="default"/>
+        <w:sz w:val="20"/>
+      </w:rPr>
+    </w:lvl>
+    <w:lvl w:ilvl="2" w:tentative="1">
+      <w:start w:val="1"/>
+      <w:numFmt w:val="decimal"/>
+      <w:lvlText w:val="%3."/>
+      <w:lvlJc w:val="left"/>
+      <w:pPr>
+        <w:tabs>
+          <w:tab w:val="num" w:pos="2160"/>
+        </w:tabs>
+        <w:ind w:left="2160" w:hanging="360"/>
+      </w:pPr>
+    </w:lvl>
+    <w:lvl w:ilvl="3" w:tentative="1">
+      <w:start w:val="1"/>
+      <w:numFmt w:val="decimal"/>
+      <w:lvlText w:val="%4."/>
+      <w:lvlJc w:val="left"/>
+      <w:pPr>
+        <w:tabs>
+          <w:tab w:val="num" w:pos="2880"/>
+        </w:tabs>
+        <w:ind w:left="2880" w:hanging="360"/>
+      </w:pPr>
+    </w:lvl>
+    <w:lvl w:ilvl="4" w:tentative="1">
+      <w:start w:val="1"/>
+      <w:numFmt w:val="decimal"/>
+      <w:lvlText w:val="%5."/>
+      <w:lvlJc w:val="left"/>
+      <w:pPr>
+        <w:tabs>
+          <w:tab w:val="num" w:pos="3600"/>
+        </w:tabs>
+        <w:ind w:left="3600" w:hanging="360"/>
+      </w:pPr>
+    </w:lvl>
+    <w:lvl w:ilvl="5" w:tentative="1">
+      <w:start w:val="1"/>
+      <w:numFmt w:val="decimal"/>
+      <w:lvlText w:val="%6."/>
+      <w:lvlJc w:val="left"/>
+      <w:pPr>
+        <w:tabs>
+          <w:tab w:val="num" w:pos="4320"/>
+        </w:tabs>
+        <w:ind w:left="4320" w:hanging="360"/>
+      </w:pPr>
+    </w:lvl>
+    <w:lvl w:ilvl="6" w:tentative="1">
+      <w:start w:val="1"/>
+      <w:numFmt w:val="decimal"/>
+      <w:lvlText w:val="%7."/>
+      <w:lvlJc w:val="left"/>
+      <w:pPr>
+        <w:tabs>
+          <w:tab w:val="num" w:pos="5040"/>
+        </w:tabs>
+        <w:ind w:left="5040" w:hanging="360"/>
+      </w:pPr>
+    </w:lvl>
+    <w:lvl w:ilvl="7" w:tentative="1">
+      <w:start w:val="1"/>
+      <w:numFmt w:val="decimal"/>
+      <w:lvlText w:val="%8."/>
+      <w:lvlJc w:val="left"/>
+      <w:pPr>
+        <w:tabs>
+          <w:tab w:val="num" w:pos="5760"/>
+        </w:tabs>
+        <w:ind w:left="5760" w:hanging="360"/>
+      </w:pPr>
+    </w:lvl>
+    <w:lvl w:ilvl="8" w:tentative="1">
+      <w:start w:val="1"/>
+      <w:numFmt w:val="decimal"/>
+      <w:lvlText w:val="%9."/>
+      <w:lvlJc w:val="left"/>
+      <w:pPr>
+        <w:tabs>
+          <w:tab w:val="num" w:pos="6480"/>
+        </w:tabs>
+        <w:ind w:left="6480" w:hanging="360"/>
+      </w:pPr>
+    </w:lvl>
+  </w:abstractNum>
+  <w:abstractNum w:abstractNumId="1" w15:restartNumberingAfterBreak="0">
     <w:nsid w:val="1119205F"/>
     <w:multiLevelType w:val="multilevel"/>
     <w:tmpl w:val="4E9ADE20"/>
@@ -5160,7 +8088,7 @@
       </w:rPr>
     </w:lvl>
   </w:abstractNum>
-  <w:abstractNum w:abstractNumId="1" w15:restartNumberingAfterBreak="0">
+  <w:abstractNum w:abstractNumId="2" w15:restartNumberingAfterBreak="0">
     <w:nsid w:val="11B32EAA"/>
     <w:multiLevelType w:val="multilevel"/>
     <w:tmpl w:val="DFAEC3B2"/>
@@ -5309,7 +8237,7 @@
       </w:rPr>
     </w:lvl>
   </w:abstractNum>
-  <w:abstractNum w:abstractNumId="2" w15:restartNumberingAfterBreak="0">
+  <w:abstractNum w:abstractNumId="3" w15:restartNumberingAfterBreak="0">
     <w:nsid w:val="1C343AC8"/>
     <w:multiLevelType w:val="multilevel"/>
     <w:tmpl w:val="A45CDCDA"/>
@@ -5422,7 +8350,269 @@
       </w:pPr>
     </w:lvl>
   </w:abstractNum>
-  <w:abstractNum w:abstractNumId="3" w15:restartNumberingAfterBreak="0">
+  <w:abstractNum w:abstractNumId="4" w15:restartNumberingAfterBreak="0">
+    <w:nsid w:val="2E983CA1"/>
+    <w:multiLevelType w:val="multilevel"/>
+    <w:tmpl w:val="55C84610"/>
+    <w:lvl w:ilvl="0">
+      <w:start w:val="1"/>
+      <w:numFmt w:val="decimal"/>
+      <w:lvlText w:val="%1."/>
+      <w:lvlJc w:val="left"/>
+      <w:pPr>
+        <w:tabs>
+          <w:tab w:val="num" w:pos="720"/>
+        </w:tabs>
+        <w:ind w:left="720" w:hanging="360"/>
+      </w:pPr>
+    </w:lvl>
+    <w:lvl w:ilvl="1" w:tentative="1">
+      <w:start w:val="1"/>
+      <w:numFmt w:val="decimal"/>
+      <w:lvlText w:val="%2."/>
+      <w:lvlJc w:val="left"/>
+      <w:pPr>
+        <w:tabs>
+          <w:tab w:val="num" w:pos="1440"/>
+        </w:tabs>
+        <w:ind w:left="1440" w:hanging="360"/>
+      </w:pPr>
+    </w:lvl>
+    <w:lvl w:ilvl="2" w:tentative="1">
+      <w:start w:val="1"/>
+      <w:numFmt w:val="decimal"/>
+      <w:lvlText w:val="%3."/>
+      <w:lvlJc w:val="left"/>
+      <w:pPr>
+        <w:tabs>
+          <w:tab w:val="num" w:pos="2160"/>
+        </w:tabs>
+        <w:ind w:left="2160" w:hanging="360"/>
+      </w:pPr>
+    </w:lvl>
+    <w:lvl w:ilvl="3" w:tentative="1">
+      <w:start w:val="1"/>
+      <w:numFmt w:val="decimal"/>
+      <w:lvlText w:val="%4."/>
+      <w:lvlJc w:val="left"/>
+      <w:pPr>
+        <w:tabs>
+          <w:tab w:val="num" w:pos="2880"/>
+        </w:tabs>
+        <w:ind w:left="2880" w:hanging="360"/>
+      </w:pPr>
+    </w:lvl>
+    <w:lvl w:ilvl="4" w:tentative="1">
+      <w:start w:val="1"/>
+      <w:numFmt w:val="decimal"/>
+      <w:lvlText w:val="%5."/>
+      <w:lvlJc w:val="left"/>
+      <w:pPr>
+        <w:tabs>
+          <w:tab w:val="num" w:pos="3600"/>
+        </w:tabs>
+        <w:ind w:left="3600" w:hanging="360"/>
+      </w:pPr>
+    </w:lvl>
+    <w:lvl w:ilvl="5" w:tentative="1">
+      <w:start w:val="1"/>
+      <w:numFmt w:val="decimal"/>
+      <w:lvlText w:val="%6."/>
+      <w:lvlJc w:val="left"/>
+      <w:pPr>
+        <w:tabs>
+          <w:tab w:val="num" w:pos="4320"/>
+        </w:tabs>
+        <w:ind w:left="4320" w:hanging="360"/>
+      </w:pPr>
+    </w:lvl>
+    <w:lvl w:ilvl="6" w:tentative="1">
+      <w:start w:val="1"/>
+      <w:numFmt w:val="decimal"/>
+      <w:lvlText w:val="%7."/>
+      <w:lvlJc w:val="left"/>
+      <w:pPr>
+        <w:tabs>
+          <w:tab w:val="num" w:pos="5040"/>
+        </w:tabs>
+        <w:ind w:left="5040" w:hanging="360"/>
+      </w:pPr>
+    </w:lvl>
+    <w:lvl w:ilvl="7" w:tentative="1">
+      <w:start w:val="1"/>
+      <w:numFmt w:val="decimal"/>
+      <w:lvlText w:val="%8."/>
+      <w:lvlJc w:val="left"/>
+      <w:pPr>
+        <w:tabs>
+          <w:tab w:val="num" w:pos="5760"/>
+        </w:tabs>
+        <w:ind w:left="5760" w:hanging="360"/>
+      </w:pPr>
+    </w:lvl>
+    <w:lvl w:ilvl="8" w:tentative="1">
+      <w:start w:val="1"/>
+      <w:numFmt w:val="decimal"/>
+      <w:lvlText w:val="%9."/>
+      <w:lvlJc w:val="left"/>
+      <w:pPr>
+        <w:tabs>
+          <w:tab w:val="num" w:pos="6480"/>
+        </w:tabs>
+        <w:ind w:left="6480" w:hanging="360"/>
+      </w:pPr>
+    </w:lvl>
+  </w:abstractNum>
+  <w:abstractNum w:abstractNumId="5" w15:restartNumberingAfterBreak="0">
+    <w:nsid w:val="3F945303"/>
+    <w:multiLevelType w:val="multilevel"/>
+    <w:tmpl w:val="D9B23216"/>
+    <w:lvl w:ilvl="0">
+      <w:start w:val="1"/>
+      <w:numFmt w:val="bullet"/>
+      <w:lvlText w:val=""/>
+      <w:lvlJc w:val="left"/>
+      <w:pPr>
+        <w:tabs>
+          <w:tab w:val="num" w:pos="720"/>
+        </w:tabs>
+        <w:ind w:left="720" w:hanging="360"/>
+      </w:pPr>
+      <w:rPr>
+        <w:rFonts w:ascii="Symbol" w:hAnsi="Symbol" w:hint="default"/>
+        <w:sz w:val="20"/>
+      </w:rPr>
+    </w:lvl>
+    <w:lvl w:ilvl="1" w:tentative="1">
+      <w:start w:val="1"/>
+      <w:numFmt w:val="bullet"/>
+      <w:lvlText w:val="o"/>
+      <w:lvlJc w:val="left"/>
+      <w:pPr>
+        <w:tabs>
+          <w:tab w:val="num" w:pos="1440"/>
+        </w:tabs>
+        <w:ind w:left="1440" w:hanging="360"/>
+      </w:pPr>
+      <w:rPr>
+        <w:rFonts w:ascii="Courier New" w:hAnsi="Courier New" w:hint="default"/>
+        <w:sz w:val="20"/>
+      </w:rPr>
+    </w:lvl>
+    <w:lvl w:ilvl="2" w:tentative="1">
+      <w:start w:val="1"/>
+      <w:numFmt w:val="bullet"/>
+      <w:lvlText w:val=""/>
+      <w:lvlJc w:val="left"/>
+      <w:pPr>
+        <w:tabs>
+          <w:tab w:val="num" w:pos="2160"/>
+        </w:tabs>
+        <w:ind w:left="2160" w:hanging="360"/>
+      </w:pPr>
+      <w:rPr>
+        <w:rFonts w:ascii="Wingdings" w:hAnsi="Wingdings" w:hint="default"/>
+        <w:sz w:val="20"/>
+      </w:rPr>
+    </w:lvl>
+    <w:lvl w:ilvl="3" w:tentative="1">
+      <w:start w:val="1"/>
+      <w:numFmt w:val="bullet"/>
+      <w:lvlText w:val=""/>
+      <w:lvlJc w:val="left"/>
+      <w:pPr>
+        <w:tabs>
+          <w:tab w:val="num" w:pos="2880"/>
+        </w:tabs>
+        <w:ind w:left="2880" w:hanging="360"/>
+      </w:pPr>
+      <w:rPr>
+        <w:rFonts w:ascii="Wingdings" w:hAnsi="Wingdings" w:hint="default"/>
+        <w:sz w:val="20"/>
+      </w:rPr>
+    </w:lvl>
+    <w:lvl w:ilvl="4" w:tentative="1">
+      <w:start w:val="1"/>
+      <w:numFmt w:val="bullet"/>
+      <w:lvlText w:val=""/>
+      <w:lvlJc w:val="left"/>
+      <w:pPr>
+        <w:tabs>
+          <w:tab w:val="num" w:pos="3600"/>
+        </w:tabs>
+        <w:ind w:left="3600" w:hanging="360"/>
+      </w:pPr>
+      <w:rPr>
+        <w:rFonts w:ascii="Wingdings" w:hAnsi="Wingdings" w:hint="default"/>
+        <w:sz w:val="20"/>
+      </w:rPr>
+    </w:lvl>
+    <w:lvl w:ilvl="5" w:tentative="1">
+      <w:start w:val="1"/>
+      <w:numFmt w:val="bullet"/>
+      <w:lvlText w:val=""/>
+      <w:lvlJc w:val="left"/>
+      <w:pPr>
+        <w:tabs>
+          <w:tab w:val="num" w:pos="4320"/>
+        </w:tabs>
+        <w:ind w:left="4320" w:hanging="360"/>
+      </w:pPr>
+      <w:rPr>
+        <w:rFonts w:ascii="Wingdings" w:hAnsi="Wingdings" w:hint="default"/>
+        <w:sz w:val="20"/>
+      </w:rPr>
+    </w:lvl>
+    <w:lvl w:ilvl="6" w:tentative="1">
+      <w:start w:val="1"/>
+      <w:numFmt w:val="bullet"/>
+      <w:lvlText w:val=""/>
+      <w:lvlJc w:val="left"/>
+      <w:pPr>
+        <w:tabs>
+          <w:tab w:val="num" w:pos="5040"/>
+        </w:tabs>
+        <w:ind w:left="5040" w:hanging="360"/>
+      </w:pPr>
+      <w:rPr>
+        <w:rFonts w:ascii="Wingdings" w:hAnsi="Wingdings" w:hint="default"/>
+        <w:sz w:val="20"/>
+      </w:rPr>
+    </w:lvl>
+    <w:lvl w:ilvl="7" w:tentative="1">
+      <w:start w:val="1"/>
+      <w:numFmt w:val="bullet"/>
+      <w:lvlText w:val=""/>
+      <w:lvlJc w:val="left"/>
+      <w:pPr>
+        <w:tabs>
+          <w:tab w:val="num" w:pos="5760"/>
+        </w:tabs>
+        <w:ind w:left="5760" w:hanging="360"/>
+      </w:pPr>
+      <w:rPr>
+        <w:rFonts w:ascii="Wingdings" w:hAnsi="Wingdings" w:hint="default"/>
+        <w:sz w:val="20"/>
+      </w:rPr>
+    </w:lvl>
+    <w:lvl w:ilvl="8" w:tentative="1">
+      <w:start w:val="1"/>
+      <w:numFmt w:val="bullet"/>
+      <w:lvlText w:val=""/>
+      <w:lvlJc w:val="left"/>
+      <w:pPr>
+        <w:tabs>
+          <w:tab w:val="num" w:pos="6480"/>
+        </w:tabs>
+        <w:ind w:left="6480" w:hanging="360"/>
+      </w:pPr>
+      <w:rPr>
+        <w:rFonts w:ascii="Wingdings" w:hAnsi="Wingdings" w:hint="default"/>
+        <w:sz w:val="20"/>
+      </w:rPr>
+    </w:lvl>
+  </w:abstractNum>
+  <w:abstractNum w:abstractNumId="6" w15:restartNumberingAfterBreak="0">
     <w:nsid w:val="405F4100"/>
     <w:multiLevelType w:val="multilevel"/>
     <w:tmpl w:val="C992652E"/>
@@ -5551,7 +8741,7 @@
       </w:rPr>
     </w:lvl>
   </w:abstractNum>
-  <w:abstractNum w:abstractNumId="4" w15:restartNumberingAfterBreak="0">
+  <w:abstractNum w:abstractNumId="7" w15:restartNumberingAfterBreak="0">
     <w:nsid w:val="54411C2A"/>
     <w:multiLevelType w:val="multilevel"/>
     <w:tmpl w:val="3CF6387C"/>
@@ -5664,7 +8854,7 @@
       </w:pPr>
     </w:lvl>
   </w:abstractNum>
-  <w:abstractNum w:abstractNumId="5" w15:restartNumberingAfterBreak="0">
+  <w:abstractNum w:abstractNumId="8" w15:restartNumberingAfterBreak="0">
     <w:nsid w:val="6F5907D8"/>
     <w:multiLevelType w:val="multilevel"/>
     <w:tmpl w:val="16C015E6"/>
@@ -5814,22 +9004,31 @@
     </w:lvl>
   </w:abstractNum>
   <w:num w:numId="1" w16cid:durableId="1816406567">
+    <w:abstractNumId w:val="6"/>
+  </w:num>
+  <w:num w:numId="2" w16cid:durableId="194343400">
+    <w:abstractNumId w:val="1"/>
+  </w:num>
+  <w:num w:numId="3" w16cid:durableId="558053160">
+    <w:abstractNumId w:val="7"/>
+  </w:num>
+  <w:num w:numId="4" w16cid:durableId="891576205">
+    <w:abstractNumId w:val="8"/>
+  </w:num>
+  <w:num w:numId="5" w16cid:durableId="383333873">
     <w:abstractNumId w:val="3"/>
   </w:num>
-  <w:num w:numId="2" w16cid:durableId="194343400">
+  <w:num w:numId="6" w16cid:durableId="2115978976">
+    <w:abstractNumId w:val="2"/>
+  </w:num>
+  <w:num w:numId="7" w16cid:durableId="403115058">
     <w:abstractNumId w:val="0"/>
   </w:num>
-  <w:num w:numId="3" w16cid:durableId="558053160">
+  <w:num w:numId="8" w16cid:durableId="732235356">
     <w:abstractNumId w:val="4"/>
   </w:num>
-  <w:num w:numId="4" w16cid:durableId="891576205">
+  <w:num w:numId="9" w16cid:durableId="1888909995">
     <w:abstractNumId w:val="5"/>
-  </w:num>
-  <w:num w:numId="5" w16cid:durableId="383333873">
-    <w:abstractNumId w:val="2"/>
-  </w:num>
-  <w:num w:numId="6" w16cid:durableId="2115978976">
-    <w:abstractNumId w:val="1"/>
   </w:num>
 </w:numbering>
 </file>

</xml_diff>